<commit_message>
Merge Firms tab into Benchmarking, add full-service firms and revenue to niche tab, trim rate cards to 2023+ Nordic data, add Flygt economics to briefing
Co-Authored-By: Claude Opus 5.5 <noreply@anthropic.com>
Claude-Session: https://claude.ai/code/session_01Tu61bPEQej1E6sErbEFanY
</commit_message>
<xml_diff>
--- a/research/swedish_legal_charging_rates.docx
+++ b/research/swedish_legal_charging_rates.docx
@@ -90,7 +90,7 @@
         </w:rPr>
         <w:t xml:space="preserve"> Source: </w:t>
       </w:r>
-      <w:hyperlink w:history="1" r:id="rIdg-jm5hlam24mp7fjaeuyr">
+      <w:hyperlink w:history="1" r:id="rId2eh5yjzjtwal9bt6vvt51">
         <w:r>
           <w:rPr>
             <w:rStyle w:val="Hyperlink"/>
@@ -194,7 +194,7 @@
         </w:rPr>
         <w:t xml:space="preserve"> Source: </w:t>
       </w:r>
-      <w:hyperlink w:history="1" r:id="rIdjvlnf3qjwlpawapreasas">
+      <w:hyperlink w:history="1" r:id="rId28qtjlw50ci5qaaf-hzr3">
         <w:r>
           <w:rPr>
             <w:rStyle w:val="Hyperlink"/>
@@ -247,7 +247,7 @@
         </w:rPr>
         <w:t xml:space="preserve"> Source: </w:t>
       </w:r>
-      <w:hyperlink w:history="1" r:id="rIde_aenu-3zlq430uhpzsax">
+      <w:hyperlink w:history="1" r:id="rIdndvlhgiejcqtfprypxokh">
         <w:r>
           <w:rPr>
             <w:rStyle w:val="Hyperlink"/>
@@ -1595,7 +1595,7 @@
         </w:rPr>
         <w:t xml:space="preserve"> Source: </w:t>
       </w:r>
-      <w:hyperlink w:history="1" r:id="rId5l8w6kh3tosiaotbbbvct">
+      <w:hyperlink w:history="1" r:id="rIdpdjmkug4rpqzolssesn87">
         <w:r>
           <w:rPr>
             <w:rStyle w:val="Hyperlink"/>
@@ -1648,7 +1648,7 @@
         </w:rPr>
         <w:t xml:space="preserve"> Source: </w:t>
       </w:r>
-      <w:hyperlink w:history="1" r:id="rIdmtflvnjeopt1ss718sbiq">
+      <w:hyperlink w:history="1" r:id="rId4ftuvg7z865rd86d8otve">
         <w:r>
           <w:rPr>
             <w:rStyle w:val="Hyperlink"/>
@@ -1701,7 +1701,7 @@
         </w:rPr>
         <w:t xml:space="preserve"> Source: </w:t>
       </w:r>
-      <w:hyperlink w:history="1" r:id="rIdrtxirex4xdneu2tm2w_qw">
+      <w:hyperlink w:history="1" r:id="rIdtinkw6a7lu9iym7htixs7">
         <w:r>
           <w:rPr>
             <w:rStyle w:val="Hyperlink"/>
@@ -1754,7 +1754,7 @@
         </w:rPr>
         <w:t xml:space="preserve"> Source: </w:t>
       </w:r>
-      <w:hyperlink w:history="1" r:id="rIdnrpnsbu-vsxonoyzk2yx7">
+      <w:hyperlink w:history="1" r:id="rIdsv7qr4wubdgiof49ytrc8">
         <w:r>
           <w:rPr>
             <w:rStyle w:val="Hyperlink"/>
@@ -1770,8 +1770,8 @@
     </w:p>
     <w:p>
       <w:pPr>
-        <w:pStyle w:val="Heading1"/>
-        <w:spacing w:after="120" w:before="280"/>
+        <w:pStyle w:val="Heading2"/>
+        <w:spacing w:after="80" w:before="200"/>
       </w:pPr>
       <w:r>
         <w:rPr>
@@ -1779,10 +1779,23 @@
           <w:b/>
           <w:bCs/>
           <w:color w:val="1F3864"/>
-          <w:sz w:val="28"/>
-          <w:szCs w:val="28"/>
-        </w:rPr>
-        <w:t xml:space="preserve">2. Nordic rate trends and client pushback</w:t>
+          <w:sz w:val="23"/>
+          <w:szCs w:val="23"/>
+        </w:rPr>
+        <w:t xml:space="preserve">Top-firm economics: profit distribution, rates and leverage (Vinge and Mannheimer Swartling)</w:t>
+      </w:r>
+    </w:p>
+    <w:p>
+      <w:pPr>
+        <w:spacing w:after="120"/>
+      </w:pPr>
+      <w:r>
+        <w:rPr>
+          <w:rFonts w:ascii="Calibri" w:cs="Calibri" w:eastAsia="Calibri" w:hAnsi="Calibri"/>
+          <w:sz w:val="21"/>
+          <w:szCs w:val="21"/>
+        </w:rPr>
+        <w:t xml:space="preserve">Based on Realtid's interview series with Olle Flygt (advokat with three decades at Vinge and Mannheimer Swartling), published 1 April 2026, supplemented with FY2025 annual-report data:</w:t>
       </w:r>
     </w:p>
     <w:p>
@@ -1800,7 +1813,7 @@
           <w:sz w:val="21"/>
           <w:szCs w:val="21"/>
         </w:rPr>
-        <w:t xml:space="preserve">Affärsvärlden: market growth 8.4% and operating margin 13.5% while lawyer headcount grew only 3.7%; firms are "better at charging".</w:t>
+        <w:t xml:space="preserve">Business model: "hours times price". A partner bills SEK 7,000–9,000/h; beneath each partner sit three to five associates billing ~SEK 3,000/h who "cost at most a third" of that. The result is "a very efficient billing machine" that takes firms such as Roschier, Vinge and Mannheimer Swartling to SEK 1bn+ revenue.</w:t>
       </w:r>
       <w:r>
         <w:rPr>
@@ -1811,7 +1824,7 @@
           <w:sz w:val="19"/>
           <w:szCs w:val="19"/>
         </w:rPr>
-        <w:t xml:space="preserve"> [2024]</w:t>
+        <w:t xml:space="preserve"> [2026]</w:t>
       </w:r>
       <w:r>
         <w:rPr>
@@ -1824,7 +1837,501 @@
         </w:rPr>
         <w:t xml:space="preserve"> Source: </w:t>
       </w:r>
-      <w:hyperlink w:history="1" r:id="rIdl2m9ggvaxzlcvqr-iq30i">
+      <w:hyperlink w:history="1" r:id="rIds6ehwqs8e0g1bjps9aqeo">
+        <w:r>
+          <w:rPr>
+            <w:rStyle w:val="Hyperlink"/>
+            <w:rFonts w:ascii="Calibri" w:cs="Calibri" w:eastAsia="Calibri" w:hAnsi="Calibri"/>
+            <w:i/>
+            <w:iCs/>
+            <w:sz w:val="18"/>
+            <w:szCs w:val="18"/>
+          </w:rPr>
+          <w:t xml:space="preserve">Realtid, 1 Apr 2026</w:t>
+        </w:r>
+      </w:hyperlink>
+    </w:p>
+    <w:p>
+      <w:pPr>
+        <w:pStyle w:val="ListParagraph"/>
+        <w:numPr>
+          <w:ilvl w:val="0"/>
+          <w:numId w:val="2"/>
+        </w:numPr>
+        <w:spacing w:after="80"/>
+      </w:pPr>
+      <w:r>
+        <w:rPr>
+          <w:rFonts w:ascii="Calibri" w:cs="Calibri" w:eastAsia="Calibri" w:hAnsi="Calibri"/>
+          <w:sz w:val="21"/>
+          <w:szCs w:val="21"/>
+        </w:rPr>
+        <w:t xml:space="preserve">Leverage: "It is built on leverage. The more people under you, the better." And: "the bigger you make the matters, the bigger the invoices."</w:t>
+      </w:r>
+      <w:r>
+        <w:rPr>
+          <w:rFonts w:ascii="Calibri" w:cs="Calibri" w:eastAsia="Calibri" w:hAnsi="Calibri"/>
+          <w:b/>
+          <w:bCs/>
+          <w:color w:val="595959"/>
+          <w:sz w:val="19"/>
+          <w:szCs w:val="19"/>
+        </w:rPr>
+        <w:t xml:space="preserve"> [2026]</w:t>
+      </w:r>
+      <w:r>
+        <w:rPr>
+          <w:rFonts w:ascii="Calibri" w:cs="Calibri" w:eastAsia="Calibri" w:hAnsi="Calibri"/>
+          <w:i/>
+          <w:iCs/>
+          <w:color w:val="595959"/>
+          <w:sz w:val="18"/>
+          <w:szCs w:val="18"/>
+        </w:rPr>
+        <w:t xml:space="preserve"> Source: </w:t>
+      </w:r>
+      <w:hyperlink w:history="1" r:id="rIddbvw9eakn0rlwkmw-_6ec">
+        <w:r>
+          <w:rPr>
+            <w:rStyle w:val="Hyperlink"/>
+            <w:rFonts w:ascii="Calibri" w:cs="Calibri" w:eastAsia="Calibri" w:hAnsi="Calibri"/>
+            <w:i/>
+            <w:iCs/>
+            <w:sz w:val="18"/>
+            <w:szCs w:val="18"/>
+          </w:rPr>
+          <w:t xml:space="preserve">Realtid, 1 Apr 2026</w:t>
+        </w:r>
+      </w:hyperlink>
+    </w:p>
+    <w:p>
+      <w:pPr>
+        <w:pStyle w:val="ListParagraph"/>
+        <w:numPr>
+          <w:ilvl w:val="0"/>
+          <w:numId w:val="2"/>
+        </w:numPr>
+        <w:spacing w:after="80"/>
+      </w:pPr>
+      <w:r>
+        <w:rPr>
+          <w:rFonts w:ascii="Calibri" w:cs="Calibri" w:eastAsia="Calibri" w:hAnsi="Calibri"/>
+          <w:sz w:val="21"/>
+          <w:szCs w:val="21"/>
+        </w:rPr>
+        <w:t xml:space="preserve">Profit distribution differs: Vinge rewards the individual partner's importance and contribution; Mannheimer Swartling shares profit equally (lockstep) with a deduction for junior partners. Some partners could switch firm and earn double, but it rarely happens; the two firms watch each other closely.</w:t>
+      </w:r>
+      <w:r>
+        <w:rPr>
+          <w:rFonts w:ascii="Calibri" w:cs="Calibri" w:eastAsia="Calibri" w:hAnsi="Calibri"/>
+          <w:b/>
+          <w:bCs/>
+          <w:color w:val="595959"/>
+          <w:sz w:val="19"/>
+          <w:szCs w:val="19"/>
+        </w:rPr>
+        <w:t xml:space="preserve"> [2026]</w:t>
+      </w:r>
+      <w:r>
+        <w:rPr>
+          <w:rFonts w:ascii="Calibri" w:cs="Calibri" w:eastAsia="Calibri" w:hAnsi="Calibri"/>
+          <w:i/>
+          <w:iCs/>
+          <w:color w:val="595959"/>
+          <w:sz w:val="18"/>
+          <w:szCs w:val="18"/>
+        </w:rPr>
+        <w:t xml:space="preserve"> Source: </w:t>
+      </w:r>
+      <w:hyperlink w:history="1" r:id="rIdhw5b-ya8vhbxez-jt1vzp">
+        <w:r>
+          <w:rPr>
+            <w:rStyle w:val="Hyperlink"/>
+            <w:rFonts w:ascii="Calibri" w:cs="Calibri" w:eastAsia="Calibri" w:hAnsi="Calibri"/>
+            <w:i/>
+            <w:iCs/>
+            <w:sz w:val="18"/>
+            <w:szCs w:val="18"/>
+          </w:rPr>
+          <w:t xml:space="preserve">Realtid, 1 Apr 2026</w:t>
+        </w:r>
+      </w:hyperlink>
+    </w:p>
+    <w:p>
+      <w:pPr>
+        <w:pStyle w:val="ListParagraph"/>
+        <w:numPr>
+          <w:ilvl w:val="0"/>
+          <w:numId w:val="2"/>
+        </w:numPr>
+        <w:spacing w:after="80"/>
+      </w:pPr>
+      <w:r>
+        <w:rPr>
+          <w:rFonts w:ascii="Calibri" w:cs="Calibri" w:eastAsia="Calibri" w:hAnsi="Calibri"/>
+          <w:sz w:val="21"/>
+          <w:szCs w:val="21"/>
+        </w:rPr>
+        <w:t xml:space="preserve">Profit distributed (FY2025): Mannheimer Swartling proposed SEK 617m (up from 582m), ~SEK 6.8m per partner across 92 partners; Vinge Stockholm SEK 273m (down from 286m), ~SEK 5.5m each across 49 partners; Vinge Malmö SEK 32m to 14 partners.</w:t>
+      </w:r>
+      <w:r>
+        <w:rPr>
+          <w:rFonts w:ascii="Calibri" w:cs="Calibri" w:eastAsia="Calibri" w:hAnsi="Calibri"/>
+          <w:b/>
+          <w:bCs/>
+          <w:color w:val="595959"/>
+          <w:sz w:val="19"/>
+          <w:szCs w:val="19"/>
+        </w:rPr>
+        <w:t xml:space="preserve"> [FY2025]</w:t>
+      </w:r>
+      <w:r>
+        <w:rPr>
+          <w:rFonts w:ascii="Calibri" w:cs="Calibri" w:eastAsia="Calibri" w:hAnsi="Calibri"/>
+          <w:i/>
+          <w:iCs/>
+          <w:color w:val="595959"/>
+          <w:sz w:val="18"/>
+          <w:szCs w:val="18"/>
+        </w:rPr>
+        <w:t xml:space="preserve"> Source: </w:t>
+      </w:r>
+      <w:hyperlink w:history="1" r:id="rIdnzlaf87e_gvzowl0ptivp">
+        <w:r>
+          <w:rPr>
+            <w:rStyle w:val="Hyperlink"/>
+            <w:rFonts w:ascii="Calibri" w:cs="Calibri" w:eastAsia="Calibri" w:hAnsi="Calibri"/>
+            <w:i/>
+            <w:iCs/>
+            <w:sz w:val="18"/>
+            <w:szCs w:val="18"/>
+          </w:rPr>
+          <w:t xml:space="preserve">Realtid (Dagens Juridik), 7 Aug 2026</w:t>
+        </w:r>
+      </w:hyperlink>
+    </w:p>
+    <w:p>
+      <w:pPr>
+        <w:pStyle w:val="ListParagraph"/>
+        <w:numPr>
+          <w:ilvl w:val="0"/>
+          <w:numId w:val="2"/>
+        </w:numPr>
+        <w:spacing w:after="80"/>
+      </w:pPr>
+      <w:r>
+        <w:rPr>
+          <w:rFonts w:ascii="Calibri" w:cs="Calibri" w:eastAsia="Calibri" w:hAnsi="Calibri"/>
+          <w:sz w:val="21"/>
+          <w:szCs w:val="21"/>
+        </w:rPr>
+        <w:t xml:space="preserve">Ownership: law firms can only be owned by their partners (no listing, unlike e.g. EQT), which brings privileges such as protection from police searches and confidentiality, and makes profit distribution central.</w:t>
+      </w:r>
+      <w:r>
+        <w:rPr>
+          <w:rFonts w:ascii="Calibri" w:cs="Calibri" w:eastAsia="Calibri" w:hAnsi="Calibri"/>
+          <w:b/>
+          <w:bCs/>
+          <w:color w:val="595959"/>
+          <w:sz w:val="19"/>
+          <w:szCs w:val="19"/>
+        </w:rPr>
+        <w:t xml:space="preserve"> [2026]</w:t>
+      </w:r>
+      <w:r>
+        <w:rPr>
+          <w:rFonts w:ascii="Calibri" w:cs="Calibri" w:eastAsia="Calibri" w:hAnsi="Calibri"/>
+          <w:i/>
+          <w:iCs/>
+          <w:color w:val="595959"/>
+          <w:sz w:val="18"/>
+          <w:szCs w:val="18"/>
+        </w:rPr>
+        <w:t xml:space="preserve"> Source: </w:t>
+      </w:r>
+      <w:hyperlink w:history="1" r:id="rIdvzgwcdtd_6barhcgnqh7y">
+        <w:r>
+          <w:rPr>
+            <w:rStyle w:val="Hyperlink"/>
+            <w:rFonts w:ascii="Calibri" w:cs="Calibri" w:eastAsia="Calibri" w:hAnsi="Calibri"/>
+            <w:i/>
+            <w:iCs/>
+            <w:sz w:val="18"/>
+            <w:szCs w:val="18"/>
+          </w:rPr>
+          <w:t xml:space="preserve">Realtid, 1 Apr 2026</w:t>
+        </w:r>
+      </w:hyperlink>
+    </w:p>
+    <w:p>
+      <w:pPr>
+        <w:pStyle w:val="ListParagraph"/>
+        <w:numPr>
+          <w:ilvl w:val="0"/>
+          <w:numId w:val="2"/>
+        </w:numPr>
+        <w:spacing w:after="80"/>
+      </w:pPr>
+      <w:r>
+        <w:rPr>
+          <w:rFonts w:ascii="Calibri" w:cs="Calibri" w:eastAsia="Calibri" w:hAnsi="Calibri"/>
+          <w:sz w:val="21"/>
+          <w:szCs w:val="21"/>
+        </w:rPr>
+        <w:t xml:space="preserve">Conflict: "There is a conflict between the law firm's demand for high profitability and what is the best advice." Flygt calls big firms a "golden cage", financially attractive but hard to leave.</w:t>
+      </w:r>
+      <w:r>
+        <w:rPr>
+          <w:rFonts w:ascii="Calibri" w:cs="Calibri" w:eastAsia="Calibri" w:hAnsi="Calibri"/>
+          <w:b/>
+          <w:bCs/>
+          <w:color w:val="595959"/>
+          <w:sz w:val="19"/>
+          <w:szCs w:val="19"/>
+        </w:rPr>
+        <w:t xml:space="preserve"> [2026]</w:t>
+      </w:r>
+      <w:r>
+        <w:rPr>
+          <w:rFonts w:ascii="Calibri" w:cs="Calibri" w:eastAsia="Calibri" w:hAnsi="Calibri"/>
+          <w:i/>
+          <w:iCs/>
+          <w:color w:val="595959"/>
+          <w:sz w:val="18"/>
+          <w:szCs w:val="18"/>
+        </w:rPr>
+        <w:t xml:space="preserve"> Source: </w:t>
+      </w:r>
+      <w:hyperlink w:history="1" r:id="rIdki1_qfwrgbnoepokhkkph">
+        <w:r>
+          <w:rPr>
+            <w:rStyle w:val="Hyperlink"/>
+            <w:rFonts w:ascii="Calibri" w:cs="Calibri" w:eastAsia="Calibri" w:hAnsi="Calibri"/>
+            <w:i/>
+            <w:iCs/>
+            <w:sz w:val="18"/>
+            <w:szCs w:val="18"/>
+          </w:rPr>
+          <w:t xml:space="preserve">Realtid, 1 Apr and 26 Apr 2026</w:t>
+        </w:r>
+      </w:hyperlink>
+    </w:p>
+    <w:p>
+      <w:pPr>
+        <w:spacing w:after="120"/>
+      </w:pPr>
+      <w:r>
+        <w:rPr>
+          <w:rFonts w:ascii="Calibri" w:cs="Calibri" w:eastAsia="Calibri" w:hAnsi="Calibri"/>
+          <w:b/>
+          <w:bCs/>
+          <w:sz w:val="21"/>
+          <w:szCs w:val="21"/>
+        </w:rPr>
+        <w:t xml:space="preserve">Illustrative leverage economics: </w:t>
+      </w:r>
+      <w:r>
+        <w:rPr>
+          <w:rFonts w:ascii="Calibri" w:cs="Calibri" w:eastAsia="Calibri" w:hAnsi="Calibri"/>
+          <w:sz w:val="21"/>
+          <w:szCs w:val="21"/>
+        </w:rPr>
+        <w:t xml:space="preserve">an associate billing SEK 3,000/h at a cost of at most ~SEK 1,000/h contributes ≥SEK 2,000 per billed hour; at 1,400–1,600 billed hours that is ~SEK 2.8–3.2m per associate per year, or ~SEK 8–16m per partner with three to five associates, before overheads. This is why leverage (and its exposure to AI, see section 4) drives partner profit.</w:t>
+      </w:r>
+    </w:p>
+    <w:p>
+      <w:pPr>
+        <w:pStyle w:val="Heading2"/>
+        <w:spacing w:after="80" w:before="200"/>
+      </w:pPr>
+      <w:r>
+        <w:rPr>
+          <w:rFonts w:ascii="Calibri" w:cs="Calibri" w:eastAsia="Calibri" w:hAnsi="Calibri"/>
+          <w:b/>
+          <w:bCs/>
+          <w:color w:val="1F3864"/>
+          <w:sz w:val="23"/>
+          <w:szCs w:val="23"/>
+        </w:rPr>
+        <w:t xml:space="preserve">Realised rates, 2023 onwards</w:t>
+      </w:r>
+    </w:p>
+    <w:p>
+      <w:pPr>
+        <w:pStyle w:val="ListParagraph"/>
+        <w:numPr>
+          <w:ilvl w:val="0"/>
+          <w:numId w:val="2"/>
+        </w:numPr>
+        <w:spacing w:after="80"/>
+      </w:pPr>
+      <w:r>
+        <w:rPr>
+          <w:rFonts w:ascii="Calibri" w:cs="Calibri" w:eastAsia="Calibri" w:hAnsi="Calibri"/>
+          <w:sz w:val="21"/>
+          <w:szCs w:val="21"/>
+        </w:rPr>
+        <w:t xml:space="preserve">Mannheimer Swartling's realised blended rate on the Northvolt restructuring was ~SEK 4,000/h (~6,000 hours, SEK 32m), the lowest of all advisers; this compares with list partner rates of SEK 6,000–10,000/h and illustrates the gap between list and realised rates.</w:t>
+      </w:r>
+      <w:r>
+        <w:rPr>
+          <w:rFonts w:ascii="Calibri" w:cs="Calibri" w:eastAsia="Calibri" w:hAnsi="Calibri"/>
+          <w:b/>
+          <w:bCs/>
+          <w:color w:val="595959"/>
+          <w:sz w:val="19"/>
+          <w:szCs w:val="19"/>
+        </w:rPr>
+        <w:t xml:space="preserve"> [Nov 2024 – Mar 2025]</w:t>
+      </w:r>
+      <w:r>
+        <w:rPr>
+          <w:rFonts w:ascii="Calibri" w:cs="Calibri" w:eastAsia="Calibri" w:hAnsi="Calibri"/>
+          <w:i/>
+          <w:iCs/>
+          <w:color w:val="595959"/>
+          <w:sz w:val="18"/>
+          <w:szCs w:val="18"/>
+        </w:rPr>
+        <w:t xml:space="preserve"> Source: </w:t>
+      </w:r>
+      <w:hyperlink w:history="1" r:id="rIdt9cpdwsihs8wfcjyvldru">
+        <w:r>
+          <w:rPr>
+            <w:rStyle w:val="Hyperlink"/>
+            <w:rFonts w:ascii="Calibri" w:cs="Calibri" w:eastAsia="Calibri" w:hAnsi="Calibri"/>
+            <w:i/>
+            <w:iCs/>
+            <w:sz w:val="18"/>
+            <w:szCs w:val="18"/>
+          </w:rPr>
+          <w:t xml:space="preserve">Affärsvärlden, 2 May 2025</w:t>
+        </w:r>
+      </w:hyperlink>
+    </w:p>
+    <w:p>
+      <w:pPr>
+        <w:pStyle w:val="ListParagraph"/>
+        <w:numPr>
+          <w:ilvl w:val="0"/>
+          <w:numId w:val="2"/>
+        </w:numPr>
+        <w:spacing w:after="80"/>
+      </w:pPr>
+      <w:r>
+        <w:rPr>
+          <w:rFonts w:ascii="Calibri" w:cs="Calibri" w:eastAsia="Calibri" w:hAnsi="Calibri"/>
+          <w:sz w:val="21"/>
+          <w:szCs w:val="21"/>
+        </w:rPr>
+        <w:t xml:space="preserve">Luleå tingsrätt held SEK 4,000/h reasonable for law-firm counsel in a cost ruling.</w:t>
+      </w:r>
+      <w:r>
+        <w:rPr>
+          <w:rFonts w:ascii="Calibri" w:cs="Calibri" w:eastAsia="Calibri" w:hAnsi="Calibri"/>
+          <w:b/>
+          <w:bCs/>
+          <w:color w:val="595959"/>
+          <w:sz w:val="19"/>
+          <w:szCs w:val="19"/>
+        </w:rPr>
+        <w:t xml:space="preserve"> [Apr 2026]</w:t>
+      </w:r>
+      <w:r>
+        <w:rPr>
+          <w:rFonts w:ascii="Calibri" w:cs="Calibri" w:eastAsia="Calibri" w:hAnsi="Calibri"/>
+          <w:i/>
+          <w:iCs/>
+          <w:color w:val="595959"/>
+          <w:sz w:val="18"/>
+          <w:szCs w:val="18"/>
+        </w:rPr>
+        <w:t xml:space="preserve"> Source: </w:t>
+      </w:r>
+      <w:hyperlink w:history="1" r:id="rIdhqmamiqnlecm7vxbf3mhu">
+        <w:r>
+          <w:rPr>
+            <w:rStyle w:val="Hyperlink"/>
+            <w:rFonts w:ascii="Calibri" w:cs="Calibri" w:eastAsia="Calibri" w:hAnsi="Calibri"/>
+            <w:i/>
+            <w:iCs/>
+            <w:sz w:val="18"/>
+            <w:szCs w:val="18"/>
+          </w:rPr>
+          <w:t xml:space="preserve">Realtid, 25 Apr 2026</w:t>
+        </w:r>
+      </w:hyperlink>
+    </w:p>
+    <w:p>
+      <w:pPr>
+        <w:spacing w:after="120"/>
+      </w:pPr>
+      <w:r>
+        <w:rPr>
+          <w:rFonts w:ascii="Calibri" w:cs="Calibri" w:eastAsia="Calibri" w:hAnsi="Calibri"/>
+          <w:sz w:val="21"/>
+          <w:szCs w:val="21"/>
+        </w:rPr>
+        <w:t xml:space="preserve">Both points sit close to the ~SEK 2,600–2,950/h blended realised rate implied by industry fee income per lawyer (section 5), suggesting realised blended rates of roughly SEK 3,000–4,000/h at top firms.</w:t>
+      </w:r>
+    </w:p>
+    <w:p>
+      <w:pPr>
+        <w:pStyle w:val="Heading1"/>
+        <w:spacing w:after="120" w:before="280"/>
+      </w:pPr>
+      <w:r>
+        <w:rPr>
+          <w:rFonts w:ascii="Calibri" w:cs="Calibri" w:eastAsia="Calibri" w:hAnsi="Calibri"/>
+          <w:b/>
+          <w:bCs/>
+          <w:color w:val="1F3864"/>
+          <w:sz w:val="28"/>
+          <w:szCs w:val="28"/>
+        </w:rPr>
+        <w:t xml:space="preserve">2. Nordic rate trends and client pushback</w:t>
+      </w:r>
+    </w:p>
+    <w:p>
+      <w:pPr>
+        <w:pStyle w:val="ListParagraph"/>
+        <w:numPr>
+          <w:ilvl w:val="0"/>
+          <w:numId w:val="2"/>
+        </w:numPr>
+        <w:spacing w:after="80"/>
+      </w:pPr>
+      <w:r>
+        <w:rPr>
+          <w:rFonts w:ascii="Calibri" w:cs="Calibri" w:eastAsia="Calibri" w:hAnsi="Calibri"/>
+          <w:sz w:val="21"/>
+          <w:szCs w:val="21"/>
+        </w:rPr>
+        <w:t xml:space="preserve">Affärsvärlden: market growth 8.4% and operating margin 13.5% while lawyer headcount grew only 3.7%; firms are "better at charging".</w:t>
+      </w:r>
+      <w:r>
+        <w:rPr>
+          <w:rFonts w:ascii="Calibri" w:cs="Calibri" w:eastAsia="Calibri" w:hAnsi="Calibri"/>
+          <w:b/>
+          <w:bCs/>
+          <w:color w:val="595959"/>
+          <w:sz w:val="19"/>
+          <w:szCs w:val="19"/>
+        </w:rPr>
+        <w:t xml:space="preserve"> [2024]</w:t>
+      </w:r>
+      <w:r>
+        <w:rPr>
+          <w:rFonts w:ascii="Calibri" w:cs="Calibri" w:eastAsia="Calibri" w:hAnsi="Calibri"/>
+          <w:i/>
+          <w:iCs/>
+          <w:color w:val="595959"/>
+          <w:sz w:val="18"/>
+          <w:szCs w:val="18"/>
+        </w:rPr>
+        <w:t xml:space="preserve"> Source: </w:t>
+      </w:r>
+      <w:hyperlink w:history="1" r:id="rIduerqqcwbtyjqyix905joe">
         <w:r>
           <w:rPr>
             <w:rStyle w:val="Hyperlink"/>
@@ -1928,7 +2435,7 @@
         </w:rPr>
         <w:t xml:space="preserve"> Source: </w:t>
       </w:r>
-      <w:hyperlink w:history="1" r:id="rIdevws--szdtbvueoyhsdyk">
+      <w:hyperlink w:history="1" r:id="rIdnq33e7qhrshyvznqms8c2">
         <w:r>
           <w:rPr>
             <w:rStyle w:val="Hyperlink"/>
@@ -1981,7 +2488,7 @@
         </w:rPr>
         <w:t xml:space="preserve"> Source: </w:t>
       </w:r>
-      <w:hyperlink w:history="1" r:id="rIdyz1lrvffld9onu8amvjpm">
+      <w:hyperlink w:history="1" r:id="rIdurlrqpxolvtr93df9jzrd">
         <w:r>
           <w:rPr>
             <w:rStyle w:val="Hyperlink"/>
@@ -2034,7 +2541,7 @@
         </w:rPr>
         <w:t xml:space="preserve"> Source: </w:t>
       </w:r>
-      <w:hyperlink w:history="1" r:id="rId3mptl8dk77vptv_ip0lfa">
+      <w:hyperlink w:history="1" r:id="rIdu1hrrguisejnw66gwn2rc">
         <w:r>
           <w:rPr>
             <w:rStyle w:val="Hyperlink"/>
@@ -2087,7 +2594,7 @@
         </w:rPr>
         <w:t xml:space="preserve"> Source: </w:t>
       </w:r>
-      <w:hyperlink w:history="1" r:id="rId9ofznnvmw4tgplrxsqjig">
+      <w:hyperlink w:history="1" r:id="rIdmdgqdvfhdzfza5i7fswhb">
         <w:r>
           <w:rPr>
             <w:rStyle w:val="Hyperlink"/>
@@ -2157,7 +2664,7 @@
         </w:rPr>
         <w:t xml:space="preserve"> Source: </w:t>
       </w:r>
-      <w:hyperlink w:history="1" r:id="rIdkwcxxv8zszz8p_opgcxiq">
+      <w:hyperlink w:history="1" r:id="rIdsnnny5p1erl8haljfvzvn">
         <w:r>
           <w:rPr>
             <w:rStyle w:val="Hyperlink"/>
@@ -2346,7 +2853,7 @@
         </w:rPr>
         <w:t xml:space="preserve"> Source: </w:t>
       </w:r>
-      <w:hyperlink w:history="1" r:id="rIdccvjy_-080thz4iaxk_el">
+      <w:hyperlink w:history="1" r:id="rIdjnwl52crforl_lfdmv5qx">
         <w:r>
           <w:rPr>
             <w:rStyle w:val="Hyperlink"/>
@@ -2399,7 +2906,7 @@
         </w:rPr>
         <w:t xml:space="preserve"> Source: </w:t>
       </w:r>
-      <w:hyperlink w:history="1" r:id="rIdzhkuohi3ciezdatr5e5sv">
+      <w:hyperlink w:history="1" r:id="rIdsr1m9z0qu_xx78vzwzt1y">
         <w:r>
           <w:rPr>
             <w:rStyle w:val="Hyperlink"/>
@@ -2452,7 +2959,7 @@
         </w:rPr>
         <w:t xml:space="preserve"> Source: </w:t>
       </w:r>
-      <w:hyperlink w:history="1" r:id="rId-zgeryanartonpbau-bov">
+      <w:hyperlink w:history="1" r:id="rIdajktr6sz5ge1memi0-_q4">
         <w:r>
           <w:rPr>
             <w:rStyle w:val="Hyperlink"/>
@@ -2505,7 +3012,7 @@
         </w:rPr>
         <w:t xml:space="preserve"> Source: </w:t>
       </w:r>
-      <w:hyperlink w:history="1" r:id="rId5f1zjpr8pudjixn5extdf">
+      <w:hyperlink w:history="1" r:id="rIdy9hh8a7k4miyz0zxjj3zt">
         <w:r>
           <w:rPr>
             <w:rStyle w:val="Hyperlink"/>
@@ -2558,7 +3065,7 @@
         </w:rPr>
         <w:t xml:space="preserve"> Source: </w:t>
       </w:r>
-      <w:hyperlink w:history="1" r:id="rId1xj_-43fhxsinu5nxzpq5">
+      <w:hyperlink w:history="1" r:id="rIde_b3ei8gmjcc6kw2emssm">
         <w:r>
           <w:rPr>
             <w:rStyle w:val="Hyperlink"/>
@@ -2611,7 +3118,7 @@
         </w:rPr>
         <w:t xml:space="preserve"> Source: </w:t>
       </w:r>
-      <w:hyperlink w:history="1" r:id="rIdgzoqem5lucaysvxjyidhy">
+      <w:hyperlink w:history="1" r:id="rIdtrbq2iablxooigu_dzrf_">
         <w:r>
           <w:rPr>
             <w:rStyle w:val="Hyperlink"/>
@@ -2657,7 +3164,7 @@
           <w:sz w:val="21"/>
           <w:szCs w:val="21"/>
         </w:rPr>
-        <w:t xml:space="preserve">Delphi (Agnes Hammarstrand): AI efficiency pushes senior hourly rates up as routine junior hours disappear; Delphi favours fixed monthly subscription arrangements over hourly billing.</w:t>
+        <w:t xml:space="preserve">Delphi (Agnes Hammarstrand): "Colleagues tell me that what we did in a working day now takes five minutes. So how do we charge?" She argues hourly billing is "almost an outdated way to charge", favours fixed monthly subscriptions, and sees AI efficiency pushing senior rates up as junior hours disappear.</w:t>
       </w:r>
       <w:r>
         <w:rPr>
@@ -2681,7 +3188,7 @@
         </w:rPr>
         <w:t xml:space="preserve"> Source: </w:t>
       </w:r>
-      <w:hyperlink w:history="1" r:id="rIdkktvqfhnwlflrflc856wl">
+      <w:hyperlink w:history="1" r:id="rIdc_qpgkaarevik4uh04np4">
         <w:r>
           <w:rPr>
             <w:rStyle w:val="Hyperlink"/>
@@ -2734,7 +3241,7 @@
         </w:rPr>
         <w:t xml:space="preserve"> Source: </w:t>
       </w:r>
-      <w:hyperlink w:history="1" r:id="rIdpwkdqrxpmy9yhx9u7ymrh">
+      <w:hyperlink w:history="1" r:id="rIdzaufbeurxz-cpswo52ehn">
         <w:r>
           <w:rPr>
             <w:rStyle w:val="Hyperlink"/>
@@ -2787,7 +3294,7 @@
         </w:rPr>
         <w:t xml:space="preserve"> Source: </w:t>
       </w:r>
-      <w:hyperlink w:history="1" r:id="rIdnsqikgu9los4moawcuutt">
+      <w:hyperlink w:history="1" r:id="rIdrtoexuatg9csa91xk4vge">
         <w:r>
           <w:rPr>
             <w:rStyle w:val="Hyperlink"/>
@@ -2840,7 +3347,7 @@
         </w:rPr>
         <w:t xml:space="preserve"> Source: </w:t>
       </w:r>
-      <w:hyperlink w:history="1" r:id="rIddnlhtheh_1d6e-zr3q4gt">
+      <w:hyperlink w:history="1" r:id="rIdiijvzme-qdx4ft8m_2ylo">
         <w:r>
           <w:rPr>
             <w:rStyle w:val="Hyperlink"/>
@@ -2933,7 +3440,7 @@
         </w:rPr>
         <w:t xml:space="preserve"> Source: </w:t>
       </w:r>
-      <w:hyperlink w:history="1" r:id="rIdwcoro23_eeljai52z_ybb">
+      <w:hyperlink w:history="1" r:id="rIdjx1bsqe1_9qwxspefgmy_">
         <w:r>
           <w:rPr>
             <w:rStyle w:val="Hyperlink"/>
@@ -4212,7 +4719,7 @@
         </w:rPr>
         <w:t xml:space="preserve"> Source: </w:t>
       </w:r>
-      <w:hyperlink w:history="1" r:id="rIdvxhsm2r0te4xv-q8bkdjb">
+      <w:hyperlink w:history="1" r:id="rIdb_qlsc9eztxzidto7veoy">
         <w:r>
           <w:rPr>
             <w:rStyle w:val="Hyperlink"/>
@@ -4265,7 +4772,7 @@
         </w:rPr>
         <w:t xml:space="preserve"> Source: </w:t>
       </w:r>
-      <w:hyperlink w:history="1" r:id="rId1pmwinq-psqbrimxiqmkh">
+      <w:hyperlink w:history="1" r:id="rIdm09qjqi3amj_tm8l4hsac">
         <w:r>
           <w:rPr>
             <w:rStyle w:val="Hyperlink"/>
@@ -4318,7 +4825,7 @@
         </w:rPr>
         <w:t xml:space="preserve"> Source: </w:t>
       </w:r>
-      <w:hyperlink w:history="1" r:id="rIdjhlw8qiwroa1okyl9a7up">
+      <w:hyperlink w:history="1" r:id="rIdn8wtf7m_1hno_fa9ayulh">
         <w:r>
           <w:rPr>
             <w:rStyle w:val="Hyperlink"/>
@@ -4371,7 +4878,7 @@
         </w:rPr>
         <w:t xml:space="preserve"> Source: </w:t>
       </w:r>
-      <w:hyperlink w:history="1" r:id="rId12axtg2ejia8y7xuqk2kz">
+      <w:hyperlink w:history="1" r:id="rIdeg-eawuv-plyfsadcqolo">
         <w:r>
           <w:rPr>
             <w:rStyle w:val="Hyperlink"/>
@@ -4424,7 +4931,7 @@
         </w:rPr>
         <w:t xml:space="preserve"> Source: </w:t>
       </w:r>
-      <w:hyperlink w:history="1" r:id="rIdsag4zlkzca9d7hi647seu">
+      <w:hyperlink w:history="1" r:id="rId7csqxizlxnlv2u2qfnmsb">
         <w:r>
           <w:rPr>
             <w:rStyle w:val="Hyperlink"/>

</xml_diff>

<commit_message>
Add utilisation benchmarks (C2 block and briefing section 5b); fix sheet order
Co-Authored-By: Claude Opus 5.5 <noreply@anthropic.com>
Claude-Session: https://claude.ai/code/session_01Tu61bPEQej1E6sErbEFanY
</commit_message>
<xml_diff>
--- a/research/swedish_legal_charging_rates.docx
+++ b/research/swedish_legal_charging_rates.docx
@@ -90,7 +90,7 @@
         </w:rPr>
         <w:t xml:space="preserve"> Source: </w:t>
       </w:r>
-      <w:hyperlink w:history="1" r:id="rId2eh5yjzjtwal9bt6vvt51">
+      <w:hyperlink w:history="1" r:id="rIdflrdjrlpceo38zdmg8yys">
         <w:r>
           <w:rPr>
             <w:rStyle w:val="Hyperlink"/>
@@ -194,7 +194,7 @@
         </w:rPr>
         <w:t xml:space="preserve"> Source: </w:t>
       </w:r>
-      <w:hyperlink w:history="1" r:id="rId28qtjlw50ci5qaaf-hzr3">
+      <w:hyperlink w:history="1" r:id="rId6x9emddqv9aecd8eq2ech">
         <w:r>
           <w:rPr>
             <w:rStyle w:val="Hyperlink"/>
@@ -247,7 +247,7 @@
         </w:rPr>
         <w:t xml:space="preserve"> Source: </w:t>
       </w:r>
-      <w:hyperlink w:history="1" r:id="rIdndvlhgiejcqtfprypxokh">
+      <w:hyperlink w:history="1" r:id="rIdqu8avolvwy5rt4waqzyfr">
         <w:r>
           <w:rPr>
             <w:rStyle w:val="Hyperlink"/>
@@ -1595,7 +1595,7 @@
         </w:rPr>
         <w:t xml:space="preserve"> Source: </w:t>
       </w:r>
-      <w:hyperlink w:history="1" r:id="rIdpdjmkug4rpqzolssesn87">
+      <w:hyperlink w:history="1" r:id="rIdsvo3l0ih7u1b8h0egvyqn">
         <w:r>
           <w:rPr>
             <w:rStyle w:val="Hyperlink"/>
@@ -1648,7 +1648,7 @@
         </w:rPr>
         <w:t xml:space="preserve"> Source: </w:t>
       </w:r>
-      <w:hyperlink w:history="1" r:id="rId4ftuvg7z865rd86d8otve">
+      <w:hyperlink w:history="1" r:id="rIdmua1zn7kccgpfxueppneb">
         <w:r>
           <w:rPr>
             <w:rStyle w:val="Hyperlink"/>
@@ -1701,7 +1701,7 @@
         </w:rPr>
         <w:t xml:space="preserve"> Source: </w:t>
       </w:r>
-      <w:hyperlink w:history="1" r:id="rIdtinkw6a7lu9iym7htixs7">
+      <w:hyperlink w:history="1" r:id="rIdo0fhvecsdwfobxypbpezf">
         <w:r>
           <w:rPr>
             <w:rStyle w:val="Hyperlink"/>
@@ -1754,7 +1754,7 @@
         </w:rPr>
         <w:t xml:space="preserve"> Source: </w:t>
       </w:r>
-      <w:hyperlink w:history="1" r:id="rIdsv7qr4wubdgiof49ytrc8">
+      <w:hyperlink w:history="1" r:id="rIdc6svbr5qexkvjzhyooug-">
         <w:r>
           <w:rPr>
             <w:rStyle w:val="Hyperlink"/>
@@ -1837,7 +1837,7 @@
         </w:rPr>
         <w:t xml:space="preserve"> Source: </w:t>
       </w:r>
-      <w:hyperlink w:history="1" r:id="rIds6ehwqs8e0g1bjps9aqeo">
+      <w:hyperlink w:history="1" r:id="rIdzgwees3ivjuseutbdxgcj">
         <w:r>
           <w:rPr>
             <w:rStyle w:val="Hyperlink"/>
@@ -1890,7 +1890,7 @@
         </w:rPr>
         <w:t xml:space="preserve"> Source: </w:t>
       </w:r>
-      <w:hyperlink w:history="1" r:id="rIddbvw9eakn0rlwkmw-_6ec">
+      <w:hyperlink w:history="1" r:id="rIdreqtrin9dlj9bxyo58pob">
         <w:r>
           <w:rPr>
             <w:rStyle w:val="Hyperlink"/>
@@ -1943,7 +1943,7 @@
         </w:rPr>
         <w:t xml:space="preserve"> Source: </w:t>
       </w:r>
-      <w:hyperlink w:history="1" r:id="rIdhw5b-ya8vhbxez-jt1vzp">
+      <w:hyperlink w:history="1" r:id="rIdevxmul5stujx_wiqpaihv">
         <w:r>
           <w:rPr>
             <w:rStyle w:val="Hyperlink"/>
@@ -1996,7 +1996,7 @@
         </w:rPr>
         <w:t xml:space="preserve"> Source: </w:t>
       </w:r>
-      <w:hyperlink w:history="1" r:id="rIdnzlaf87e_gvzowl0ptivp">
+      <w:hyperlink w:history="1" r:id="rIdcsz3_bfu_88iz87m0nag-">
         <w:r>
           <w:rPr>
             <w:rStyle w:val="Hyperlink"/>
@@ -2049,7 +2049,7 @@
         </w:rPr>
         <w:t xml:space="preserve"> Source: </w:t>
       </w:r>
-      <w:hyperlink w:history="1" r:id="rIdvzgwcdtd_6barhcgnqh7y">
+      <w:hyperlink w:history="1" r:id="rIdtkcszpqohdpoqpf5enug_">
         <w:r>
           <w:rPr>
             <w:rStyle w:val="Hyperlink"/>
@@ -2102,7 +2102,7 @@
         </w:rPr>
         <w:t xml:space="preserve"> Source: </w:t>
       </w:r>
-      <w:hyperlink w:history="1" r:id="rIdki1_qfwrgbnoepokhkkph">
+      <w:hyperlink w:history="1" r:id="rIdqc4wkxujub3scg_glglcg">
         <w:r>
           <w:rPr>
             <w:rStyle w:val="Hyperlink"/>
@@ -2195,7 +2195,7 @@
         </w:rPr>
         <w:t xml:space="preserve"> Source: </w:t>
       </w:r>
-      <w:hyperlink w:history="1" r:id="rIdt9cpdwsihs8wfcjyvldru">
+      <w:hyperlink w:history="1" r:id="rId0rl4ky37ae3zgy_btqa1c">
         <w:r>
           <w:rPr>
             <w:rStyle w:val="Hyperlink"/>
@@ -2248,7 +2248,7 @@
         </w:rPr>
         <w:t xml:space="preserve"> Source: </w:t>
       </w:r>
-      <w:hyperlink w:history="1" r:id="rIdhqmamiqnlecm7vxbf3mhu">
+      <w:hyperlink w:history="1" r:id="rIdmfe00gbbunrq5leuuxier">
         <w:r>
           <w:rPr>
             <w:rStyle w:val="Hyperlink"/>
@@ -2331,7 +2331,7 @@
         </w:rPr>
         <w:t xml:space="preserve"> Source: </w:t>
       </w:r>
-      <w:hyperlink w:history="1" r:id="rIduerqqcwbtyjqyix905joe">
+      <w:hyperlink w:history="1" r:id="rIdstrbimnkigetw6cxhtwvt">
         <w:r>
           <w:rPr>
             <w:rStyle w:val="Hyperlink"/>
@@ -2435,7 +2435,7 @@
         </w:rPr>
         <w:t xml:space="preserve"> Source: </w:t>
       </w:r>
-      <w:hyperlink w:history="1" r:id="rIdnq33e7qhrshyvznqms8c2">
+      <w:hyperlink w:history="1" r:id="rIdeendcdz7dpbhml03umipd">
         <w:r>
           <w:rPr>
             <w:rStyle w:val="Hyperlink"/>
@@ -2488,7 +2488,7 @@
         </w:rPr>
         <w:t xml:space="preserve"> Source: </w:t>
       </w:r>
-      <w:hyperlink w:history="1" r:id="rIdurlrqpxolvtr93df9jzrd">
+      <w:hyperlink w:history="1" r:id="rIdm3oddnivnmqigwxqfbelw">
         <w:r>
           <w:rPr>
             <w:rStyle w:val="Hyperlink"/>
@@ -2541,7 +2541,7 @@
         </w:rPr>
         <w:t xml:space="preserve"> Source: </w:t>
       </w:r>
-      <w:hyperlink w:history="1" r:id="rIdu1hrrguisejnw66gwn2rc">
+      <w:hyperlink w:history="1" r:id="rId769jy2almazx23hkvykn5">
         <w:r>
           <w:rPr>
             <w:rStyle w:val="Hyperlink"/>
@@ -2594,7 +2594,7 @@
         </w:rPr>
         <w:t xml:space="preserve"> Source: </w:t>
       </w:r>
-      <w:hyperlink w:history="1" r:id="rIdmdgqdvfhdzfza5i7fswhb">
+      <w:hyperlink w:history="1" r:id="rIdjvwx7phsatdfkusikslgy">
         <w:r>
           <w:rPr>
             <w:rStyle w:val="Hyperlink"/>
@@ -2664,7 +2664,7 @@
         </w:rPr>
         <w:t xml:space="preserve"> Source: </w:t>
       </w:r>
-      <w:hyperlink w:history="1" r:id="rIdsnnny5p1erl8haljfvzvn">
+      <w:hyperlink w:history="1" r:id="rIdhkuczrn3k4_vqfda070ca">
         <w:r>
           <w:rPr>
             <w:rStyle w:val="Hyperlink"/>
@@ -2853,7 +2853,7 @@
         </w:rPr>
         <w:t xml:space="preserve"> Source: </w:t>
       </w:r>
-      <w:hyperlink w:history="1" r:id="rIdjnwl52crforl_lfdmv5qx">
+      <w:hyperlink w:history="1" r:id="rId2ejrq1jo4mlwxhdmzdq-m">
         <w:r>
           <w:rPr>
             <w:rStyle w:val="Hyperlink"/>
@@ -2906,7 +2906,7 @@
         </w:rPr>
         <w:t xml:space="preserve"> Source: </w:t>
       </w:r>
-      <w:hyperlink w:history="1" r:id="rIdsr1m9z0qu_xx78vzwzt1y">
+      <w:hyperlink w:history="1" r:id="rIdu-c8ybrbig1xdrtbc75ww">
         <w:r>
           <w:rPr>
             <w:rStyle w:val="Hyperlink"/>
@@ -2959,7 +2959,7 @@
         </w:rPr>
         <w:t xml:space="preserve"> Source: </w:t>
       </w:r>
-      <w:hyperlink w:history="1" r:id="rIdajktr6sz5ge1memi0-_q4">
+      <w:hyperlink w:history="1" r:id="rId5xg8eae71gje5_pjmt2hf">
         <w:r>
           <w:rPr>
             <w:rStyle w:val="Hyperlink"/>
@@ -3012,7 +3012,7 @@
         </w:rPr>
         <w:t xml:space="preserve"> Source: </w:t>
       </w:r>
-      <w:hyperlink w:history="1" r:id="rIdy9hh8a7k4miyz0zxjj3zt">
+      <w:hyperlink w:history="1" r:id="rIdgjov_f-ik4hn66jg7ie4m">
         <w:r>
           <w:rPr>
             <w:rStyle w:val="Hyperlink"/>
@@ -3065,7 +3065,7 @@
         </w:rPr>
         <w:t xml:space="preserve"> Source: </w:t>
       </w:r>
-      <w:hyperlink w:history="1" r:id="rIde_b3ei8gmjcc6kw2emssm">
+      <w:hyperlink w:history="1" r:id="rIdesqspbut9lymyq39fs8fr">
         <w:r>
           <w:rPr>
             <w:rStyle w:val="Hyperlink"/>
@@ -3118,7 +3118,7 @@
         </w:rPr>
         <w:t xml:space="preserve"> Source: </w:t>
       </w:r>
-      <w:hyperlink w:history="1" r:id="rIdtrbq2iablxooigu_dzrf_">
+      <w:hyperlink w:history="1" r:id="rIdjfytdjplubmrwrrvejwas">
         <w:r>
           <w:rPr>
             <w:rStyle w:val="Hyperlink"/>
@@ -3188,7 +3188,7 @@
         </w:rPr>
         <w:t xml:space="preserve"> Source: </w:t>
       </w:r>
-      <w:hyperlink w:history="1" r:id="rIdc_qpgkaarevik4uh04np4">
+      <w:hyperlink w:history="1" r:id="rIdkex9i-ooisk7izn97ds_v">
         <w:r>
           <w:rPr>
             <w:rStyle w:val="Hyperlink"/>
@@ -3241,7 +3241,7 @@
         </w:rPr>
         <w:t xml:space="preserve"> Source: </w:t>
       </w:r>
-      <w:hyperlink w:history="1" r:id="rIdzaufbeurxz-cpswo52ehn">
+      <w:hyperlink w:history="1" r:id="rIdxlflw5a7tmpweqn0dexnt">
         <w:r>
           <w:rPr>
             <w:rStyle w:val="Hyperlink"/>
@@ -3294,7 +3294,7 @@
         </w:rPr>
         <w:t xml:space="preserve"> Source: </w:t>
       </w:r>
-      <w:hyperlink w:history="1" r:id="rIdrtoexuatg9csa91xk4vge">
+      <w:hyperlink w:history="1" r:id="rIdghonf5yk2k4f3_kqu0vwa">
         <w:r>
           <w:rPr>
             <w:rStyle w:val="Hyperlink"/>
@@ -3347,7 +3347,7 @@
         </w:rPr>
         <w:t xml:space="preserve"> Source: </w:t>
       </w:r>
-      <w:hyperlink w:history="1" r:id="rIdiijvzme-qdx4ft8m_2ylo">
+      <w:hyperlink w:history="1" r:id="rIdq3bwiipk0mmttjy0hat0c">
         <w:r>
           <w:rPr>
             <w:rStyle w:val="Hyperlink"/>
@@ -3440,7 +3440,7 @@
         </w:rPr>
         <w:t xml:space="preserve"> Source: </w:t>
       </w:r>
-      <w:hyperlink w:history="1" r:id="rIdjx1bsqe1_9qwxspefgmy_">
+      <w:hyperlink w:history="1" r:id="rIds2x-ijmyk9ms1ohu8qst_">
         <w:r>
           <w:rPr>
             <w:rStyle w:val="Hyperlink"/>
@@ -3503,6 +3503,1486 @@
           <w:szCs w:val="18"/>
         </w:rPr>
         <w:t xml:space="preserve">Calculation</w:t>
+      </w:r>
+    </w:p>
+    <w:p>
+      <w:pPr>
+        <w:pStyle w:val="Heading1"/>
+        <w:spacing w:after="120" w:before="280"/>
+      </w:pPr>
+      <w:r>
+        <w:rPr>
+          <w:rFonts w:ascii="Calibri" w:cs="Calibri" w:eastAsia="Calibri" w:hAnsi="Calibri"/>
+          <w:b/>
+          <w:bCs/>
+          <w:color w:val="1F3864"/>
+          <w:sz w:val="28"/>
+          <w:szCs w:val="28"/>
+        </w:rPr>
+        <w:t xml:space="preserve">5b. Utilisation and realisation</w:t>
+      </w:r>
+    </w:p>
+    <w:p>
+      <w:pPr>
+        <w:spacing w:after="120"/>
+      </w:pPr>
+      <w:r>
+        <w:rPr>
+          <w:rFonts w:ascii="Calibri" w:cs="Calibri" w:eastAsia="Calibri" w:hAnsi="Calibri"/>
+          <w:sz w:val="21"/>
+          <w:szCs w:val="21"/>
+        </w:rPr>
+        <w:t xml:space="preserve">Few Nordic firms publish utilisation; the evidence is mainly industry-level. Three independent Nordic bases point to ~1,200-1,300 billable hours (70-75% of a ~1,650-1,700 hour year), while large business-law firms target more for associates.</w:t>
+      </w:r>
+    </w:p>
+    <w:tbl>
+      <w:tblPr>
+        <w:tblW w:type="dxa" w:w="9026"/>
+        <w:tblBorders>
+          <w:top w:val="single" w:color="auto" w:sz="4"/>
+          <w:left w:val="single" w:color="auto" w:sz="4"/>
+          <w:bottom w:val="single" w:color="auto" w:sz="4"/>
+          <w:right w:val="single" w:color="auto" w:sz="4"/>
+          <w:insideH w:val="single" w:color="auto" w:sz="4"/>
+          <w:insideV w:val="single" w:color="auto" w:sz="4"/>
+        </w:tblBorders>
+      </w:tblPr>
+      <w:tblGrid>
+        <w:gridCol w:w="1000"/>
+        <w:gridCol w:w="2300"/>
+        <w:gridCol w:w="2900"/>
+        <w:gridCol w:w="900"/>
+        <w:gridCol w:w="1926"/>
+      </w:tblGrid>
+      <w:tr>
+        <w:trPr>
+          <w:tblHeader/>
+        </w:trPr>
+        <w:tc>
+          <w:tcPr>
+            <w:tcW w:type="dxa" w:w="1000"/>
+            <w:tcBorders>
+              <w:top w:val="single" w:color="BFBFBF" w:sz="4"/>
+              <w:left w:val="single" w:color="BFBFBF" w:sz="4"/>
+              <w:bottom w:val="single" w:color="BFBFBF" w:sz="4"/>
+              <w:right w:val="single" w:color="BFBFBF" w:sz="4"/>
+            </w:tcBorders>
+            <w:shd w:fill="1F3864" w:color="auto" w:val="clear"/>
+            <w:tcMar>
+              <w:top w:type="dxa" w:w="60"/>
+              <w:left w:type="dxa" w:w="100"/>
+              <w:bottom w:type="dxa" w:w="60"/>
+              <w:right w:type="dxa" w:w="100"/>
+            </w:tcMar>
+          </w:tcPr>
+          <w:p>
+            <w:r>
+              <w:rPr>
+                <w:rFonts w:ascii="Calibri" w:cs="Calibri" w:eastAsia="Calibri" w:hAnsi="Calibri"/>
+                <w:b/>
+                <w:bCs/>
+                <w:color w:val="FFFFFF"/>
+                <w:sz w:val="18"/>
+                <w:szCs w:val="18"/>
+              </w:rPr>
+              <w:t xml:space="preserve">Market</w:t>
+            </w:r>
+          </w:p>
+        </w:tc>
+        <w:tc>
+          <w:tcPr>
+            <w:tcW w:type="dxa" w:w="2300"/>
+            <w:tcBorders>
+              <w:top w:val="single" w:color="BFBFBF" w:sz="4"/>
+              <w:left w:val="single" w:color="BFBFBF" w:sz="4"/>
+              <w:bottom w:val="single" w:color="BFBFBF" w:sz="4"/>
+              <w:right w:val="single" w:color="BFBFBF" w:sz="4"/>
+            </w:tcBorders>
+            <w:shd w:fill="1F3864" w:color="auto" w:val="clear"/>
+            <w:tcMar>
+              <w:top w:type="dxa" w:w="60"/>
+              <w:left w:type="dxa" w:w="100"/>
+              <w:bottom w:type="dxa" w:w="60"/>
+              <w:right w:type="dxa" w:w="100"/>
+            </w:tcMar>
+          </w:tcPr>
+          <w:p>
+            <w:r>
+              <w:rPr>
+                <w:rFonts w:ascii="Calibri" w:cs="Calibri" w:eastAsia="Calibri" w:hAnsi="Calibri"/>
+                <w:b/>
+                <w:bCs/>
+                <w:color w:val="FFFFFF"/>
+                <w:sz w:val="18"/>
+                <w:szCs w:val="18"/>
+              </w:rPr>
+              <w:t xml:space="preserve">Metric</w:t>
+            </w:r>
+          </w:p>
+        </w:tc>
+        <w:tc>
+          <w:tcPr>
+            <w:tcW w:type="dxa" w:w="2900"/>
+            <w:tcBorders>
+              <w:top w:val="single" w:color="BFBFBF" w:sz="4"/>
+              <w:left w:val="single" w:color="BFBFBF" w:sz="4"/>
+              <w:bottom w:val="single" w:color="BFBFBF" w:sz="4"/>
+              <w:right w:val="single" w:color="BFBFBF" w:sz="4"/>
+            </w:tcBorders>
+            <w:shd w:fill="1F3864" w:color="auto" w:val="clear"/>
+            <w:tcMar>
+              <w:top w:type="dxa" w:w="60"/>
+              <w:left w:type="dxa" w:w="100"/>
+              <w:bottom w:type="dxa" w:w="60"/>
+              <w:right w:type="dxa" w:w="100"/>
+            </w:tcMar>
+          </w:tcPr>
+          <w:p>
+            <w:r>
+              <w:rPr>
+                <w:rFonts w:ascii="Calibri" w:cs="Calibri" w:eastAsia="Calibri" w:hAnsi="Calibri"/>
+                <w:b/>
+                <w:bCs/>
+                <w:color w:val="FFFFFF"/>
+                <w:sz w:val="18"/>
+                <w:szCs w:val="18"/>
+              </w:rPr>
+              <w:t xml:space="preserve">Value</w:t>
+            </w:r>
+          </w:p>
+        </w:tc>
+        <w:tc>
+          <w:tcPr>
+            <w:tcW w:type="dxa" w:w="900"/>
+            <w:tcBorders>
+              <w:top w:val="single" w:color="BFBFBF" w:sz="4"/>
+              <w:left w:val="single" w:color="BFBFBF" w:sz="4"/>
+              <w:bottom w:val="single" w:color="BFBFBF" w:sz="4"/>
+              <w:right w:val="single" w:color="BFBFBF" w:sz="4"/>
+            </w:tcBorders>
+            <w:shd w:fill="1F3864" w:color="auto" w:val="clear"/>
+            <w:tcMar>
+              <w:top w:type="dxa" w:w="60"/>
+              <w:left w:type="dxa" w:w="100"/>
+              <w:bottom w:type="dxa" w:w="60"/>
+              <w:right w:type="dxa" w:w="100"/>
+            </w:tcMar>
+          </w:tcPr>
+          <w:p>
+            <w:r>
+              <w:rPr>
+                <w:rFonts w:ascii="Calibri" w:cs="Calibri" w:eastAsia="Calibri" w:hAnsi="Calibri"/>
+                <w:b/>
+                <w:bCs/>
+                <w:color w:val="FFFFFF"/>
+                <w:sz w:val="18"/>
+                <w:szCs w:val="18"/>
+              </w:rPr>
+              <w:t xml:space="preserve">Period</w:t>
+            </w:r>
+          </w:p>
+        </w:tc>
+        <w:tc>
+          <w:tcPr>
+            <w:tcW w:type="dxa" w:w="1926"/>
+            <w:tcBorders>
+              <w:top w:val="single" w:color="BFBFBF" w:sz="4"/>
+              <w:left w:val="single" w:color="BFBFBF" w:sz="4"/>
+              <w:bottom w:val="single" w:color="BFBFBF" w:sz="4"/>
+              <w:right w:val="single" w:color="BFBFBF" w:sz="4"/>
+            </w:tcBorders>
+            <w:shd w:fill="1F3864" w:color="auto" w:val="clear"/>
+            <w:tcMar>
+              <w:top w:type="dxa" w:w="60"/>
+              <w:left w:type="dxa" w:w="100"/>
+              <w:bottom w:type="dxa" w:w="60"/>
+              <w:right w:type="dxa" w:w="100"/>
+            </w:tcMar>
+          </w:tcPr>
+          <w:p>
+            <w:r>
+              <w:rPr>
+                <w:rFonts w:ascii="Calibri" w:cs="Calibri" w:eastAsia="Calibri" w:hAnsi="Calibri"/>
+                <w:b/>
+                <w:bCs/>
+                <w:color w:val="FFFFFF"/>
+                <w:sz w:val="18"/>
+                <w:szCs w:val="18"/>
+              </w:rPr>
+              <w:t xml:space="preserve">Source</w:t>
+            </w:r>
+          </w:p>
+        </w:tc>
+      </w:tr>
+      <w:tr>
+        <w:tc>
+          <w:tcPr>
+            <w:tcW w:type="dxa" w:w="1000"/>
+            <w:tcBorders>
+              <w:top w:val="single" w:color="BFBFBF" w:sz="4"/>
+              <w:left w:val="single" w:color="BFBFBF" w:sz="4"/>
+              <w:bottom w:val="single" w:color="BFBFBF" w:sz="4"/>
+              <w:right w:val="single" w:color="BFBFBF" w:sz="4"/>
+            </w:tcBorders>
+            <w:tcMar>
+              <w:top w:type="dxa" w:w="60"/>
+              <w:left w:type="dxa" w:w="100"/>
+              <w:bottom w:type="dxa" w:w="60"/>
+              <w:right w:type="dxa" w:w="100"/>
+            </w:tcMar>
+          </w:tcPr>
+          <w:p>
+            <w:r>
+              <w:rPr>
+                <w:rFonts w:ascii="Calibri" w:cs="Calibri" w:eastAsia="Calibri" w:hAnsi="Calibri"/>
+                <w:b w:val="false"/>
+                <w:bCs w:val="false"/>
+                <w:color w:val="000000"/>
+                <w:sz w:val="18"/>
+                <w:szCs w:val="18"/>
+              </w:rPr>
+              <w:t xml:space="preserve">Sweden</w:t>
+            </w:r>
+          </w:p>
+        </w:tc>
+        <w:tc>
+          <w:tcPr>
+            <w:tcW w:type="dxa" w:w="2300"/>
+            <w:tcBorders>
+              <w:top w:val="single" w:color="BFBFBF" w:sz="4"/>
+              <w:left w:val="single" w:color="BFBFBF" w:sz="4"/>
+              <w:bottom w:val="single" w:color="BFBFBF" w:sz="4"/>
+              <w:right w:val="single" w:color="BFBFBF" w:sz="4"/>
+            </w:tcBorders>
+            <w:tcMar>
+              <w:top w:type="dxa" w:w="60"/>
+              <w:left w:type="dxa" w:w="100"/>
+              <w:bottom w:type="dxa" w:w="60"/>
+              <w:right w:type="dxa" w:w="100"/>
+            </w:tcMar>
+          </w:tcPr>
+          <w:p>
+            <w:r>
+              <w:rPr>
+                <w:rFonts w:ascii="Calibri" w:cs="Calibri" w:eastAsia="Calibri" w:hAnsi="Calibri"/>
+                <w:b w:val="false"/>
+                <w:bCs w:val="false"/>
+                <w:color w:val="000000"/>
+                <w:sz w:val="18"/>
+                <w:szCs w:val="18"/>
+              </w:rPr>
+              <w:t xml:space="preserve">Billable-hour requirement, business-law firms</w:t>
+            </w:r>
+          </w:p>
+        </w:tc>
+        <w:tc>
+          <w:tcPr>
+            <w:tcW w:type="dxa" w:w="2900"/>
+            <w:tcBorders>
+              <w:top w:val="single" w:color="BFBFBF" w:sz="4"/>
+              <w:left w:val="single" w:color="BFBFBF" w:sz="4"/>
+              <w:bottom w:val="single" w:color="BFBFBF" w:sz="4"/>
+              <w:right w:val="single" w:color="BFBFBF" w:sz="4"/>
+            </w:tcBorders>
+            <w:tcMar>
+              <w:top w:type="dxa" w:w="60"/>
+              <w:left w:type="dxa" w:w="100"/>
+              <w:bottom w:type="dxa" w:w="60"/>
+              <w:right w:type="dxa" w:w="100"/>
+            </w:tcMar>
+          </w:tcPr>
+          <w:p>
+            <w:r>
+              <w:rPr>
+                <w:rFonts w:ascii="Calibri" w:cs="Calibri" w:eastAsia="Calibri" w:hAnsi="Calibri"/>
+                <w:b w:val="false"/>
+                <w:bCs w:val="false"/>
+                <w:color w:val="000000"/>
+                <w:sz w:val="18"/>
+                <w:szCs w:val="18"/>
+              </w:rPr>
+              <w:t xml:space="preserve">1,400-1,600 h p.a.</w:t>
+            </w:r>
+          </w:p>
+        </w:tc>
+        <w:tc>
+          <w:tcPr>
+            <w:tcW w:type="dxa" w:w="900"/>
+            <w:tcBorders>
+              <w:top w:val="single" w:color="BFBFBF" w:sz="4"/>
+              <w:left w:val="single" w:color="BFBFBF" w:sz="4"/>
+              <w:bottom w:val="single" w:color="BFBFBF" w:sz="4"/>
+              <w:right w:val="single" w:color="BFBFBF" w:sz="4"/>
+            </w:tcBorders>
+            <w:tcMar>
+              <w:top w:type="dxa" w:w="60"/>
+              <w:left w:type="dxa" w:w="100"/>
+              <w:bottom w:type="dxa" w:w="60"/>
+              <w:right w:type="dxa" w:w="100"/>
+            </w:tcMar>
+          </w:tcPr>
+          <w:p>
+            <w:r>
+              <w:rPr>
+                <w:rFonts w:ascii="Calibri" w:cs="Calibri" w:eastAsia="Calibri" w:hAnsi="Calibri"/>
+                <w:b w:val="false"/>
+                <w:bCs w:val="false"/>
+                <w:color w:val="000000"/>
+                <w:sz w:val="18"/>
+                <w:szCs w:val="18"/>
+              </w:rPr>
+              <w:t xml:space="preserve">2018</w:t>
+            </w:r>
+          </w:p>
+        </w:tc>
+        <w:tc>
+          <w:tcPr>
+            <w:tcW w:type="dxa" w:w="1926"/>
+            <w:tcBorders>
+              <w:top w:val="single" w:color="BFBFBF" w:sz="4"/>
+              <w:left w:val="single" w:color="BFBFBF" w:sz="4"/>
+              <w:bottom w:val="single" w:color="BFBFBF" w:sz="4"/>
+              <w:right w:val="single" w:color="BFBFBF" w:sz="4"/>
+            </w:tcBorders>
+            <w:tcMar>
+              <w:top w:type="dxa" w:w="60"/>
+              <w:left w:type="dxa" w:w="100"/>
+              <w:bottom w:type="dxa" w:w="60"/>
+              <w:right w:type="dxa" w:w="100"/>
+            </w:tcMar>
+          </w:tcPr>
+          <w:p>
+            <w:r>
+              <w:rPr>
+                <w:rFonts w:ascii="Calibri" w:cs="Calibri" w:eastAsia="Calibri" w:hAnsi="Calibri"/>
+                <w:b w:val="false"/>
+                <w:bCs w:val="false"/>
+                <w:color w:val="000000"/>
+                <w:sz w:val="18"/>
+                <w:szCs w:val="18"/>
+              </w:rPr>
+              <w:t xml:space="preserve">Advokaten no. 7 2018 (snippet)</w:t>
+            </w:r>
+          </w:p>
+        </w:tc>
+      </w:tr>
+      <w:tr>
+        <w:tc>
+          <w:tcPr>
+            <w:tcW w:type="dxa" w:w="1000"/>
+            <w:tcBorders>
+              <w:top w:val="single" w:color="BFBFBF" w:sz="4"/>
+              <w:left w:val="single" w:color="BFBFBF" w:sz="4"/>
+              <w:bottom w:val="single" w:color="BFBFBF" w:sz="4"/>
+              <w:right w:val="single" w:color="BFBFBF" w:sz="4"/>
+            </w:tcBorders>
+            <w:tcMar>
+              <w:top w:type="dxa" w:w="60"/>
+              <w:left w:type="dxa" w:w="100"/>
+              <w:bottom w:type="dxa" w:w="60"/>
+              <w:right w:type="dxa" w:w="100"/>
+            </w:tcMar>
+          </w:tcPr>
+          <w:p>
+            <w:r>
+              <w:rPr>
+                <w:rFonts w:ascii="Calibri" w:cs="Calibri" w:eastAsia="Calibri" w:hAnsi="Calibri"/>
+                <w:b w:val="false"/>
+                <w:bCs w:val="false"/>
+                <w:color w:val="000000"/>
+                <w:sz w:val="18"/>
+                <w:szCs w:val="18"/>
+              </w:rPr>
+              <w:t xml:space="preserve">Sweden</w:t>
+            </w:r>
+          </w:p>
+        </w:tc>
+        <w:tc>
+          <w:tcPr>
+            <w:tcW w:type="dxa" w:w="2300"/>
+            <w:tcBorders>
+              <w:top w:val="single" w:color="BFBFBF" w:sz="4"/>
+              <w:left w:val="single" w:color="BFBFBF" w:sz="4"/>
+              <w:bottom w:val="single" w:color="BFBFBF" w:sz="4"/>
+              <w:right w:val="single" w:color="BFBFBF" w:sz="4"/>
+            </w:tcBorders>
+            <w:tcMar>
+              <w:top w:type="dxa" w:w="60"/>
+              <w:left w:type="dxa" w:w="100"/>
+              <w:bottom w:type="dxa" w:w="60"/>
+              <w:right w:type="dxa" w:w="100"/>
+            </w:tcMar>
+          </w:tcPr>
+          <w:p>
+            <w:r>
+              <w:rPr>
+                <w:rFonts w:ascii="Calibri" w:cs="Calibri" w:eastAsia="Calibri" w:hAnsi="Calibri"/>
+                <w:b w:val="false"/>
+                <w:bCs w:val="false"/>
+                <w:color w:val="000000"/>
+                <w:sz w:val="18"/>
+                <w:szCs w:val="18"/>
+              </w:rPr>
+              <w:t xml:space="preserve">Share of worked time billed</w:t>
+            </w:r>
+          </w:p>
+        </w:tc>
+        <w:tc>
+          <w:tcPr>
+            <w:tcW w:type="dxa" w:w="2900"/>
+            <w:tcBorders>
+              <w:top w:val="single" w:color="BFBFBF" w:sz="4"/>
+              <w:left w:val="single" w:color="BFBFBF" w:sz="4"/>
+              <w:bottom w:val="single" w:color="BFBFBF" w:sz="4"/>
+              <w:right w:val="single" w:color="BFBFBF" w:sz="4"/>
+            </w:tcBorders>
+            <w:tcMar>
+              <w:top w:type="dxa" w:w="60"/>
+              <w:left w:type="dxa" w:w="100"/>
+              <w:bottom w:type="dxa" w:w="60"/>
+              <w:right w:type="dxa" w:w="100"/>
+            </w:tcMar>
+          </w:tcPr>
+          <w:p>
+            <w:r>
+              <w:rPr>
+                <w:rFonts w:ascii="Calibri" w:cs="Calibri" w:eastAsia="Calibri" w:hAnsi="Calibri"/>
+                <w:b w:val="false"/>
+                <w:bCs w:val="false"/>
+                <w:color w:val="000000"/>
+                <w:sz w:val="18"/>
+                <w:szCs w:val="18"/>
+              </w:rPr>
+              <w:t xml:space="preserve">median just over 70% (range 40-90%)</w:t>
+            </w:r>
+          </w:p>
+        </w:tc>
+        <w:tc>
+          <w:tcPr>
+            <w:tcW w:type="dxa" w:w="900"/>
+            <w:tcBorders>
+              <w:top w:val="single" w:color="BFBFBF" w:sz="4"/>
+              <w:left w:val="single" w:color="BFBFBF" w:sz="4"/>
+              <w:bottom w:val="single" w:color="BFBFBF" w:sz="4"/>
+              <w:right w:val="single" w:color="BFBFBF" w:sz="4"/>
+            </w:tcBorders>
+            <w:tcMar>
+              <w:top w:type="dxa" w:w="60"/>
+              <w:left w:type="dxa" w:w="100"/>
+              <w:bottom w:type="dxa" w:w="60"/>
+              <w:right w:type="dxa" w:w="100"/>
+            </w:tcMar>
+          </w:tcPr>
+          <w:p>
+            <w:r>
+              <w:rPr>
+                <w:rFonts w:ascii="Calibri" w:cs="Calibri" w:eastAsia="Calibri" w:hAnsi="Calibri"/>
+                <w:b w:val="false"/>
+                <w:bCs w:val="false"/>
+                <w:color w:val="000000"/>
+                <w:sz w:val="18"/>
+                <w:szCs w:val="18"/>
+              </w:rPr>
+              <w:t xml:space="preserve">2012</w:t>
+            </w:r>
+          </w:p>
+        </w:tc>
+        <w:tc>
+          <w:tcPr>
+            <w:tcW w:type="dxa" w:w="1926"/>
+            <w:tcBorders>
+              <w:top w:val="single" w:color="BFBFBF" w:sz="4"/>
+              <w:left w:val="single" w:color="BFBFBF" w:sz="4"/>
+              <w:bottom w:val="single" w:color="BFBFBF" w:sz="4"/>
+              <w:right w:val="single" w:color="BFBFBF" w:sz="4"/>
+            </w:tcBorders>
+            <w:tcMar>
+              <w:top w:type="dxa" w:w="60"/>
+              <w:left w:type="dxa" w:w="100"/>
+              <w:bottom w:type="dxa" w:w="60"/>
+              <w:right w:type="dxa" w:w="100"/>
+            </w:tcMar>
+          </w:tcPr>
+          <w:p>
+            <w:r>
+              <w:rPr>
+                <w:rFonts w:ascii="Calibri" w:cs="Calibri" w:eastAsia="Calibri" w:hAnsi="Calibri"/>
+                <w:b w:val="false"/>
+                <w:bCs w:val="false"/>
+                <w:color w:val="000000"/>
+                <w:sz w:val="18"/>
+                <w:szCs w:val="18"/>
+              </w:rPr>
+              <w:t xml:space="preserve">Advokaten 2012 (snippet)</w:t>
+            </w:r>
+          </w:p>
+        </w:tc>
+      </w:tr>
+      <w:tr>
+        <w:tc>
+          <w:tcPr>
+            <w:tcW w:type="dxa" w:w="1000"/>
+            <w:tcBorders>
+              <w:top w:val="single" w:color="BFBFBF" w:sz="4"/>
+              <w:left w:val="single" w:color="BFBFBF" w:sz="4"/>
+              <w:bottom w:val="single" w:color="BFBFBF" w:sz="4"/>
+              <w:right w:val="single" w:color="BFBFBF" w:sz="4"/>
+            </w:tcBorders>
+            <w:tcMar>
+              <w:top w:type="dxa" w:w="60"/>
+              <w:left w:type="dxa" w:w="100"/>
+              <w:bottom w:type="dxa" w:w="60"/>
+              <w:right w:type="dxa" w:w="100"/>
+            </w:tcMar>
+          </w:tcPr>
+          <w:p>
+            <w:r>
+              <w:rPr>
+                <w:rFonts w:ascii="Calibri" w:cs="Calibri" w:eastAsia="Calibri" w:hAnsi="Calibri"/>
+                <w:b w:val="false"/>
+                <w:bCs w:val="false"/>
+                <w:color w:val="000000"/>
+                <w:sz w:val="18"/>
+                <w:szCs w:val="18"/>
+              </w:rPr>
+              <w:t xml:space="preserve">Sweden</w:t>
+            </w:r>
+          </w:p>
+        </w:tc>
+        <w:tc>
+          <w:tcPr>
+            <w:tcW w:type="dxa" w:w="2300"/>
+            <w:tcBorders>
+              <w:top w:val="single" w:color="BFBFBF" w:sz="4"/>
+              <w:left w:val="single" w:color="BFBFBF" w:sz="4"/>
+              <w:bottom w:val="single" w:color="BFBFBF" w:sz="4"/>
+              <w:right w:val="single" w:color="BFBFBF" w:sz="4"/>
+            </w:tcBorders>
+            <w:tcMar>
+              <w:top w:type="dxa" w:w="60"/>
+              <w:left w:type="dxa" w:w="100"/>
+              <w:bottom w:type="dxa" w:w="60"/>
+              <w:right w:type="dxa" w:w="100"/>
+            </w:tcMar>
+          </w:tcPr>
+          <w:p>
+            <w:r>
+              <w:rPr>
+                <w:rFonts w:ascii="Calibri" w:cs="Calibri" w:eastAsia="Calibri" w:hAnsi="Calibri"/>
+                <w:b w:val="false"/>
+                <w:bCs w:val="false"/>
+                <w:color w:val="000000"/>
+                <w:sz w:val="18"/>
+                <w:szCs w:val="18"/>
+              </w:rPr>
+              <w:t xml:space="preserve">Associate targets at named firms</w:t>
+            </w:r>
+          </w:p>
+        </w:tc>
+        <w:tc>
+          <w:tcPr>
+            <w:tcW w:type="dxa" w:w="2900"/>
+            <w:tcBorders>
+              <w:top w:val="single" w:color="BFBFBF" w:sz="4"/>
+              <w:left w:val="single" w:color="BFBFBF" w:sz="4"/>
+              <w:bottom w:val="single" w:color="BFBFBF" w:sz="4"/>
+              <w:right w:val="single" w:color="BFBFBF" w:sz="4"/>
+            </w:tcBorders>
+            <w:tcMar>
+              <w:top w:type="dxa" w:w="60"/>
+              <w:left w:type="dxa" w:w="100"/>
+              <w:bottom w:type="dxa" w:w="60"/>
+              <w:right w:type="dxa" w:w="100"/>
+            </w:tcMar>
+          </w:tcPr>
+          <w:p>
+            <w:r>
+              <w:rPr>
+                <w:rFonts w:ascii="Calibri" w:cs="Calibri" w:eastAsia="Calibri" w:hAnsi="Calibri"/>
+                <w:b w:val="false"/>
+                <w:bCs w:val="false"/>
+                <w:color w:val="000000"/>
+                <w:sz w:val="18"/>
+                <w:szCs w:val="18"/>
+              </w:rPr>
+              <w:t xml:space="preserve">1,350-1,700 h (Vinge, MSA 1,500; W&amp;C 1,700; Lindahl 1,350); bonus ladders 1,400-1,800 h</w:t>
+            </w:r>
+          </w:p>
+        </w:tc>
+        <w:tc>
+          <w:tcPr>
+            <w:tcW w:type="dxa" w:w="900"/>
+            <w:tcBorders>
+              <w:top w:val="single" w:color="BFBFBF" w:sz="4"/>
+              <w:left w:val="single" w:color="BFBFBF" w:sz="4"/>
+              <w:bottom w:val="single" w:color="BFBFBF" w:sz="4"/>
+              <w:right w:val="single" w:color="BFBFBF" w:sz="4"/>
+            </w:tcBorders>
+            <w:tcMar>
+              <w:top w:type="dxa" w:w="60"/>
+              <w:left w:type="dxa" w:w="100"/>
+              <w:bottom w:type="dxa" w:w="60"/>
+              <w:right w:type="dxa" w:w="100"/>
+            </w:tcMar>
+          </w:tcPr>
+          <w:p>
+            <w:r>
+              <w:rPr>
+                <w:rFonts w:ascii="Calibri" w:cs="Calibri" w:eastAsia="Calibri" w:hAnsi="Calibri"/>
+                <w:b w:val="false"/>
+                <w:bCs w:val="false"/>
+                <w:color w:val="000000"/>
+                <w:sz w:val="18"/>
+                <w:szCs w:val="18"/>
+              </w:rPr>
+              <w:t xml:space="preserve">c.2012-14</w:t>
+            </w:r>
+          </w:p>
+        </w:tc>
+        <w:tc>
+          <w:tcPr>
+            <w:tcW w:type="dxa" w:w="1926"/>
+            <w:tcBorders>
+              <w:top w:val="single" w:color="BFBFBF" w:sz="4"/>
+              <w:left w:val="single" w:color="BFBFBF" w:sz="4"/>
+              <w:bottom w:val="single" w:color="BFBFBF" w:sz="4"/>
+              <w:right w:val="single" w:color="BFBFBF" w:sz="4"/>
+            </w:tcBorders>
+            <w:tcMar>
+              <w:top w:type="dxa" w:w="60"/>
+              <w:left w:type="dxa" w:w="100"/>
+              <w:bottom w:type="dxa" w:w="60"/>
+              <w:right w:type="dxa" w:w="100"/>
+            </w:tcMar>
+          </w:tcPr>
+          <w:p>
+            <w:r>
+              <w:rPr>
+                <w:rFonts w:ascii="Calibri" w:cs="Calibri" w:eastAsia="Calibri" w:hAnsi="Calibri"/>
+                <w:b w:val="false"/>
+                <w:bCs w:val="false"/>
+                <w:color w:val="000000"/>
+                <w:sz w:val="18"/>
+                <w:szCs w:val="18"/>
+              </w:rPr>
+              <w:t xml:space="preserve">Anonymous crowd-sourced table (indicative)</w:t>
+            </w:r>
+          </w:p>
+        </w:tc>
+      </w:tr>
+      <w:tr>
+        <w:tc>
+          <w:tcPr>
+            <w:tcW w:type="dxa" w:w="1000"/>
+            <w:tcBorders>
+              <w:top w:val="single" w:color="BFBFBF" w:sz="4"/>
+              <w:left w:val="single" w:color="BFBFBF" w:sz="4"/>
+              <w:bottom w:val="single" w:color="BFBFBF" w:sz="4"/>
+              <w:right w:val="single" w:color="BFBFBF" w:sz="4"/>
+            </w:tcBorders>
+            <w:tcMar>
+              <w:top w:type="dxa" w:w="60"/>
+              <w:left w:type="dxa" w:w="100"/>
+              <w:bottom w:type="dxa" w:w="60"/>
+              <w:right w:type="dxa" w:w="100"/>
+            </w:tcMar>
+          </w:tcPr>
+          <w:p>
+            <w:r>
+              <w:rPr>
+                <w:rFonts w:ascii="Calibri" w:cs="Calibri" w:eastAsia="Calibri" w:hAnsi="Calibri"/>
+                <w:b w:val="false"/>
+                <w:bCs w:val="false"/>
+                <w:color w:val="000000"/>
+                <w:sz w:val="18"/>
+                <w:szCs w:val="18"/>
+              </w:rPr>
+              <w:t xml:space="preserve">Norway</w:t>
+            </w:r>
+          </w:p>
+        </w:tc>
+        <w:tc>
+          <w:tcPr>
+            <w:tcW w:type="dxa" w:w="2300"/>
+            <w:tcBorders>
+              <w:top w:val="single" w:color="BFBFBF" w:sz="4"/>
+              <w:left w:val="single" w:color="BFBFBF" w:sz="4"/>
+              <w:bottom w:val="single" w:color="BFBFBF" w:sz="4"/>
+              <w:right w:val="single" w:color="BFBFBF" w:sz="4"/>
+            </w:tcBorders>
+            <w:tcMar>
+              <w:top w:type="dxa" w:w="60"/>
+              <w:left w:type="dxa" w:w="100"/>
+              <w:bottom w:type="dxa" w:w="60"/>
+              <w:right w:type="dxa" w:w="100"/>
+            </w:tcMar>
+          </w:tcPr>
+          <w:p>
+            <w:r>
+              <w:rPr>
+                <w:rFonts w:ascii="Calibri" w:cs="Calibri" w:eastAsia="Calibri" w:hAnsi="Calibri"/>
+                <w:b w:val="false"/>
+                <w:bCs w:val="false"/>
+                <w:color w:val="000000"/>
+                <w:sz w:val="18"/>
+                <w:szCs w:val="18"/>
+              </w:rPr>
+              <w:t xml:space="preserve">Billing rate (faktureringsgrad)</w:t>
+            </w:r>
+          </w:p>
+        </w:tc>
+        <w:tc>
+          <w:tcPr>
+            <w:tcW w:type="dxa" w:w="2900"/>
+            <w:tcBorders>
+              <w:top w:val="single" w:color="BFBFBF" w:sz="4"/>
+              <w:left w:val="single" w:color="BFBFBF" w:sz="4"/>
+              <w:bottom w:val="single" w:color="BFBFBF" w:sz="4"/>
+              <w:right w:val="single" w:color="BFBFBF" w:sz="4"/>
+            </w:tcBorders>
+            <w:tcMar>
+              <w:top w:type="dxa" w:w="60"/>
+              <w:left w:type="dxa" w:w="100"/>
+              <w:bottom w:type="dxa" w:w="60"/>
+              <w:right w:type="dxa" w:w="100"/>
+            </w:tcMar>
+          </w:tcPr>
+          <w:p>
+            <w:r>
+              <w:rPr>
+                <w:rFonts w:ascii="Calibri" w:cs="Calibri" w:eastAsia="Calibri" w:hAnsi="Calibri"/>
+                <w:b w:val="false"/>
+                <w:bCs w:val="false"/>
+                <w:color w:val="000000"/>
+                <w:sz w:val="18"/>
+                <w:szCs w:val="18"/>
+              </w:rPr>
+              <w:t xml:space="preserve">just over 72% (~1,220 h)</w:t>
+            </w:r>
+          </w:p>
+        </w:tc>
+        <w:tc>
+          <w:tcPr>
+            <w:tcW w:type="dxa" w:w="900"/>
+            <w:tcBorders>
+              <w:top w:val="single" w:color="BFBFBF" w:sz="4"/>
+              <w:left w:val="single" w:color="BFBFBF" w:sz="4"/>
+              <w:bottom w:val="single" w:color="BFBFBF" w:sz="4"/>
+              <w:right w:val="single" w:color="BFBFBF" w:sz="4"/>
+            </w:tcBorders>
+            <w:tcMar>
+              <w:top w:type="dxa" w:w="60"/>
+              <w:left w:type="dxa" w:w="100"/>
+              <w:bottom w:type="dxa" w:w="60"/>
+              <w:right w:type="dxa" w:w="100"/>
+            </w:tcMar>
+          </w:tcPr>
+          <w:p>
+            <w:r>
+              <w:rPr>
+                <w:rFonts w:ascii="Calibri" w:cs="Calibri" w:eastAsia="Calibri" w:hAnsi="Calibri"/>
+                <w:b w:val="false"/>
+                <w:bCs w:val="false"/>
+                <w:color w:val="000000"/>
+                <w:sz w:val="18"/>
+                <w:szCs w:val="18"/>
+              </w:rPr>
+              <w:t xml:space="preserve">2016</w:t>
+            </w:r>
+          </w:p>
+        </w:tc>
+        <w:tc>
+          <w:tcPr>
+            <w:tcW w:type="dxa" w:w="1926"/>
+            <w:tcBorders>
+              <w:top w:val="single" w:color="BFBFBF" w:sz="4"/>
+              <w:left w:val="single" w:color="BFBFBF" w:sz="4"/>
+              <w:bottom w:val="single" w:color="BFBFBF" w:sz="4"/>
+              <w:right w:val="single" w:color="BFBFBF" w:sz="4"/>
+            </w:tcBorders>
+            <w:tcMar>
+              <w:top w:type="dxa" w:w="60"/>
+              <w:left w:type="dxa" w:w="100"/>
+              <w:bottom w:type="dxa" w:w="60"/>
+              <w:right w:type="dxa" w:w="100"/>
+            </w:tcMar>
+          </w:tcPr>
+          <w:p>
+            <w:r>
+              <w:rPr>
+                <w:rFonts w:ascii="Calibri" w:cs="Calibri" w:eastAsia="Calibri" w:hAnsi="Calibri"/>
+                <w:b w:val="false"/>
+                <w:bCs w:val="false"/>
+                <w:color w:val="000000"/>
+                <w:sz w:val="18"/>
+                <w:szCs w:val="18"/>
+              </w:rPr>
+              <w:t xml:space="preserve">Advokatforeningen survey</w:t>
+            </w:r>
+          </w:p>
+        </w:tc>
+      </w:tr>
+      <w:tr>
+        <w:tc>
+          <w:tcPr>
+            <w:tcW w:type="dxa" w:w="1000"/>
+            <w:tcBorders>
+              <w:top w:val="single" w:color="BFBFBF" w:sz="4"/>
+              <w:left w:val="single" w:color="BFBFBF" w:sz="4"/>
+              <w:bottom w:val="single" w:color="BFBFBF" w:sz="4"/>
+              <w:right w:val="single" w:color="BFBFBF" w:sz="4"/>
+            </w:tcBorders>
+            <w:tcMar>
+              <w:top w:type="dxa" w:w="60"/>
+              <w:left w:type="dxa" w:w="100"/>
+              <w:bottom w:type="dxa" w:w="60"/>
+              <w:right w:type="dxa" w:w="100"/>
+            </w:tcMar>
+          </w:tcPr>
+          <w:p>
+            <w:r>
+              <w:rPr>
+                <w:rFonts w:ascii="Calibri" w:cs="Calibri" w:eastAsia="Calibri" w:hAnsi="Calibri"/>
+                <w:b w:val="false"/>
+                <w:bCs w:val="false"/>
+                <w:color w:val="000000"/>
+                <w:sz w:val="18"/>
+                <w:szCs w:val="18"/>
+              </w:rPr>
+              <w:t xml:space="preserve">Norway</w:t>
+            </w:r>
+          </w:p>
+        </w:tc>
+        <w:tc>
+          <w:tcPr>
+            <w:tcW w:type="dxa" w:w="2300"/>
+            <w:tcBorders>
+              <w:top w:val="single" w:color="BFBFBF" w:sz="4"/>
+              <w:left w:val="single" w:color="BFBFBF" w:sz="4"/>
+              <w:bottom w:val="single" w:color="BFBFBF" w:sz="4"/>
+              <w:right w:val="single" w:color="BFBFBF" w:sz="4"/>
+            </w:tcBorders>
+            <w:tcMar>
+              <w:top w:type="dxa" w:w="60"/>
+              <w:left w:type="dxa" w:w="100"/>
+              <w:bottom w:type="dxa" w:w="60"/>
+              <w:right w:type="dxa" w:w="100"/>
+            </w:tcMar>
+          </w:tcPr>
+          <w:p>
+            <w:r>
+              <w:rPr>
+                <w:rFonts w:ascii="Calibri" w:cs="Calibri" w:eastAsia="Calibri" w:hAnsi="Calibri"/>
+                <w:b w:val="false"/>
+                <w:bCs w:val="false"/>
+                <w:color w:val="000000"/>
+                <w:sz w:val="18"/>
+                <w:szCs w:val="18"/>
+              </w:rPr>
+              <w:t xml:space="preserve">Associate hours</w:t>
+            </w:r>
+          </w:p>
+        </w:tc>
+        <w:tc>
+          <w:tcPr>
+            <w:tcW w:type="dxa" w:w="2900"/>
+            <w:tcBorders>
+              <w:top w:val="single" w:color="BFBFBF" w:sz="4"/>
+              <w:left w:val="single" w:color="BFBFBF" w:sz="4"/>
+              <w:bottom w:val="single" w:color="BFBFBF" w:sz="4"/>
+              <w:right w:val="single" w:color="BFBFBF" w:sz="4"/>
+            </w:tcBorders>
+            <w:tcMar>
+              <w:top w:type="dxa" w:w="60"/>
+              <w:left w:type="dxa" w:w="100"/>
+              <w:bottom w:type="dxa" w:w="60"/>
+              <w:right w:type="dxa" w:w="100"/>
+            </w:tcMar>
+          </w:tcPr>
+          <w:p>
+            <w:r>
+              <w:rPr>
+                <w:rFonts w:ascii="Calibri" w:cs="Calibri" w:eastAsia="Calibri" w:hAnsi="Calibri"/>
+                <w:b w:val="false"/>
+                <w:bCs w:val="false"/>
+                <w:color w:val="000000"/>
+                <w:sz w:val="18"/>
+                <w:szCs w:val="18"/>
+              </w:rPr>
+              <w:t xml:space="preserve">46 h/week actual vs 39 h contracted; 27% under-record</w:t>
+            </w:r>
+          </w:p>
+        </w:tc>
+        <w:tc>
+          <w:tcPr>
+            <w:tcW w:type="dxa" w:w="900"/>
+            <w:tcBorders>
+              <w:top w:val="single" w:color="BFBFBF" w:sz="4"/>
+              <w:left w:val="single" w:color="BFBFBF" w:sz="4"/>
+              <w:bottom w:val="single" w:color="BFBFBF" w:sz="4"/>
+              <w:right w:val="single" w:color="BFBFBF" w:sz="4"/>
+            </w:tcBorders>
+            <w:tcMar>
+              <w:top w:type="dxa" w:w="60"/>
+              <w:left w:type="dxa" w:w="100"/>
+              <w:bottom w:type="dxa" w:w="60"/>
+              <w:right w:type="dxa" w:w="100"/>
+            </w:tcMar>
+          </w:tcPr>
+          <w:p>
+            <w:r>
+              <w:rPr>
+                <w:rFonts w:ascii="Calibri" w:cs="Calibri" w:eastAsia="Calibri" w:hAnsi="Calibri"/>
+                <w:b w:val="false"/>
+                <w:bCs w:val="false"/>
+                <w:color w:val="000000"/>
+                <w:sz w:val="18"/>
+                <w:szCs w:val="18"/>
+              </w:rPr>
+              <w:t xml:space="preserve">Nov-2025</w:t>
+            </w:r>
+          </w:p>
+        </w:tc>
+        <w:tc>
+          <w:tcPr>
+            <w:tcW w:type="dxa" w:w="1926"/>
+            <w:tcBorders>
+              <w:top w:val="single" w:color="BFBFBF" w:sz="4"/>
+              <w:left w:val="single" w:color="BFBFBF" w:sz="4"/>
+              <w:bottom w:val="single" w:color="BFBFBF" w:sz="4"/>
+              <w:right w:val="single" w:color="BFBFBF" w:sz="4"/>
+            </w:tcBorders>
+            <w:tcMar>
+              <w:top w:type="dxa" w:w="60"/>
+              <w:left w:type="dxa" w:w="100"/>
+              <w:bottom w:type="dxa" w:w="60"/>
+              <w:right w:type="dxa" w:w="100"/>
+            </w:tcMar>
+          </w:tcPr>
+          <w:p>
+            <w:r>
+              <w:rPr>
+                <w:rFonts w:ascii="Calibri" w:cs="Calibri" w:eastAsia="Calibri" w:hAnsi="Calibri"/>
+                <w:b w:val="false"/>
+                <w:bCs w:val="false"/>
+                <w:color w:val="000000"/>
+                <w:sz w:val="18"/>
+                <w:szCs w:val="18"/>
+              </w:rPr>
+              <w:t xml:space="preserve">Juristforbundet survey</w:t>
+            </w:r>
+          </w:p>
+        </w:tc>
+      </w:tr>
+      <w:tr>
+        <w:tc>
+          <w:tcPr>
+            <w:tcW w:type="dxa" w:w="1000"/>
+            <w:tcBorders>
+              <w:top w:val="single" w:color="BFBFBF" w:sz="4"/>
+              <w:left w:val="single" w:color="BFBFBF" w:sz="4"/>
+              <w:bottom w:val="single" w:color="BFBFBF" w:sz="4"/>
+              <w:right w:val="single" w:color="BFBFBF" w:sz="4"/>
+            </w:tcBorders>
+            <w:tcMar>
+              <w:top w:type="dxa" w:w="60"/>
+              <w:left w:type="dxa" w:w="100"/>
+              <w:bottom w:type="dxa" w:w="60"/>
+              <w:right w:type="dxa" w:w="100"/>
+            </w:tcMar>
+          </w:tcPr>
+          <w:p>
+            <w:r>
+              <w:rPr>
+                <w:rFonts w:ascii="Calibri" w:cs="Calibri" w:eastAsia="Calibri" w:hAnsi="Calibri"/>
+                <w:b w:val="false"/>
+                <w:bCs w:val="false"/>
+                <w:color w:val="000000"/>
+                <w:sz w:val="18"/>
+                <w:szCs w:val="18"/>
+              </w:rPr>
+              <w:t xml:space="preserve">Denmark</w:t>
+            </w:r>
+          </w:p>
+        </w:tc>
+        <w:tc>
+          <w:tcPr>
+            <w:tcW w:type="dxa" w:w="2300"/>
+            <w:tcBorders>
+              <w:top w:val="single" w:color="BFBFBF" w:sz="4"/>
+              <w:left w:val="single" w:color="BFBFBF" w:sz="4"/>
+              <w:bottom w:val="single" w:color="BFBFBF" w:sz="4"/>
+              <w:right w:val="single" w:color="BFBFBF" w:sz="4"/>
+            </w:tcBorders>
+            <w:tcMar>
+              <w:top w:type="dxa" w:w="60"/>
+              <w:left w:type="dxa" w:w="100"/>
+              <w:bottom w:type="dxa" w:w="60"/>
+              <w:right w:type="dxa" w:w="100"/>
+            </w:tcMar>
+          </w:tcPr>
+          <w:p>
+            <w:r>
+              <w:rPr>
+                <w:rFonts w:ascii="Calibri" w:cs="Calibri" w:eastAsia="Calibri" w:hAnsi="Calibri"/>
+                <w:b w:val="false"/>
+                <w:bCs w:val="false"/>
+                <w:color w:val="000000"/>
+                <w:sz w:val="18"/>
+                <w:szCs w:val="18"/>
+              </w:rPr>
+              <w:t xml:space="preserve">Billable requirement / hours</w:t>
+            </w:r>
+          </w:p>
+        </w:tc>
+        <w:tc>
+          <w:tcPr>
+            <w:tcW w:type="dxa" w:w="2900"/>
+            <w:tcBorders>
+              <w:top w:val="single" w:color="BFBFBF" w:sz="4"/>
+              <w:left w:val="single" w:color="BFBFBF" w:sz="4"/>
+              <w:bottom w:val="single" w:color="BFBFBF" w:sz="4"/>
+              <w:right w:val="single" w:color="BFBFBF" w:sz="4"/>
+            </w:tcBorders>
+            <w:tcMar>
+              <w:top w:type="dxa" w:w="60"/>
+              <w:left w:type="dxa" w:w="100"/>
+              <w:bottom w:type="dxa" w:w="60"/>
+              <w:right w:type="dxa" w:w="100"/>
+            </w:tcMar>
+          </w:tcPr>
+          <w:p>
+            <w:r>
+              <w:rPr>
+                <w:rFonts w:ascii="Calibri" w:cs="Calibri" w:eastAsia="Calibri" w:hAnsi="Calibri"/>
+                <w:b w:val="false"/>
+                <w:bCs w:val="false"/>
+                <w:color w:val="000000"/>
+                <w:sz w:val="18"/>
+                <w:szCs w:val="18"/>
+              </w:rPr>
+              <w:t xml:space="preserve">54-55% have a fixed requirement; 46-47 h/week; associate hours down from 48.3 to 44.9 h/week over 10 years</w:t>
+            </w:r>
+          </w:p>
+        </w:tc>
+        <w:tc>
+          <w:tcPr>
+            <w:tcW w:type="dxa" w:w="900"/>
+            <w:tcBorders>
+              <w:top w:val="single" w:color="BFBFBF" w:sz="4"/>
+              <w:left w:val="single" w:color="BFBFBF" w:sz="4"/>
+              <w:bottom w:val="single" w:color="BFBFBF" w:sz="4"/>
+              <w:right w:val="single" w:color="BFBFBF" w:sz="4"/>
+            </w:tcBorders>
+            <w:tcMar>
+              <w:top w:type="dxa" w:w="60"/>
+              <w:left w:type="dxa" w:w="100"/>
+              <w:bottom w:type="dxa" w:w="60"/>
+              <w:right w:type="dxa" w:w="100"/>
+            </w:tcMar>
+          </w:tcPr>
+          <w:p>
+            <w:r>
+              <w:rPr>
+                <w:rFonts w:ascii="Calibri" w:cs="Calibri" w:eastAsia="Calibri" w:hAnsi="Calibri"/>
+                <w:b w:val="false"/>
+                <w:bCs w:val="false"/>
+                <w:color w:val="000000"/>
+                <w:sz w:val="18"/>
+                <w:szCs w:val="18"/>
+              </w:rPr>
+              <w:t xml:space="preserve">2018 / 2026</w:t>
+            </w:r>
+          </w:p>
+        </w:tc>
+        <w:tc>
+          <w:tcPr>
+            <w:tcW w:type="dxa" w:w="1926"/>
+            <w:tcBorders>
+              <w:top w:val="single" w:color="BFBFBF" w:sz="4"/>
+              <w:left w:val="single" w:color="BFBFBF" w:sz="4"/>
+              <w:bottom w:val="single" w:color="BFBFBF" w:sz="4"/>
+              <w:right w:val="single" w:color="BFBFBF" w:sz="4"/>
+            </w:tcBorders>
+            <w:tcMar>
+              <w:top w:type="dxa" w:w="60"/>
+              <w:left w:type="dxa" w:w="100"/>
+              <w:bottom w:type="dxa" w:w="60"/>
+              <w:right w:type="dxa" w:w="100"/>
+            </w:tcMar>
+          </w:tcPr>
+          <w:p>
+            <w:r>
+              <w:rPr>
+                <w:rFonts w:ascii="Calibri" w:cs="Calibri" w:eastAsia="Calibri" w:hAnsi="Calibri"/>
+                <w:b w:val="false"/>
+                <w:bCs w:val="false"/>
+                <w:color w:val="000000"/>
+                <w:sz w:val="18"/>
+                <w:szCs w:val="18"/>
+              </w:rPr>
+              <w:t xml:space="preserve">Djøf Advokat</w:t>
+            </w:r>
+          </w:p>
+        </w:tc>
+      </w:tr>
+      <w:tr>
+        <w:tc>
+          <w:tcPr>
+            <w:tcW w:type="dxa" w:w="1000"/>
+            <w:tcBorders>
+              <w:top w:val="single" w:color="BFBFBF" w:sz="4"/>
+              <w:left w:val="single" w:color="BFBFBF" w:sz="4"/>
+              <w:bottom w:val="single" w:color="BFBFBF" w:sz="4"/>
+              <w:right w:val="single" w:color="BFBFBF" w:sz="4"/>
+            </w:tcBorders>
+            <w:tcMar>
+              <w:top w:type="dxa" w:w="60"/>
+              <w:left w:type="dxa" w:w="100"/>
+              <w:bottom w:type="dxa" w:w="60"/>
+              <w:right w:type="dxa" w:w="100"/>
+            </w:tcMar>
+          </w:tcPr>
+          <w:p>
+            <w:r>
+              <w:rPr>
+                <w:rFonts w:ascii="Calibri" w:cs="Calibri" w:eastAsia="Calibri" w:hAnsi="Calibri"/>
+                <w:b w:val="false"/>
+                <w:bCs w:val="false"/>
+                <w:color w:val="000000"/>
+                <w:sz w:val="18"/>
+                <w:szCs w:val="18"/>
+              </w:rPr>
+              <w:t xml:space="preserve">Finland</w:t>
+            </w:r>
+          </w:p>
+        </w:tc>
+        <w:tc>
+          <w:tcPr>
+            <w:tcW w:type="dxa" w:w="2300"/>
+            <w:tcBorders>
+              <w:top w:val="single" w:color="BFBFBF" w:sz="4"/>
+              <w:left w:val="single" w:color="BFBFBF" w:sz="4"/>
+              <w:bottom w:val="single" w:color="BFBFBF" w:sz="4"/>
+              <w:right w:val="single" w:color="BFBFBF" w:sz="4"/>
+            </w:tcBorders>
+            <w:tcMar>
+              <w:top w:type="dxa" w:w="60"/>
+              <w:left w:type="dxa" w:w="100"/>
+              <w:bottom w:type="dxa" w:w="60"/>
+              <w:right w:type="dxa" w:w="100"/>
+            </w:tcMar>
+          </w:tcPr>
+          <w:p>
+            <w:r>
+              <w:rPr>
+                <w:rFonts w:ascii="Calibri" w:cs="Calibri" w:eastAsia="Calibri" w:hAnsi="Calibri"/>
+                <w:b w:val="false"/>
+                <w:bCs w:val="false"/>
+                <w:color w:val="000000"/>
+                <w:sz w:val="18"/>
+                <w:szCs w:val="18"/>
+              </w:rPr>
+              <w:t xml:space="preserve">Utilisation</w:t>
+            </w:r>
+          </w:p>
+        </w:tc>
+        <w:tc>
+          <w:tcPr>
+            <w:tcW w:type="dxa" w:w="2900"/>
+            <w:tcBorders>
+              <w:top w:val="single" w:color="BFBFBF" w:sz="4"/>
+              <w:left w:val="single" w:color="BFBFBF" w:sz="4"/>
+              <w:bottom w:val="single" w:color="BFBFBF" w:sz="4"/>
+              <w:right w:val="single" w:color="BFBFBF" w:sz="4"/>
+            </w:tcBorders>
+            <w:tcMar>
+              <w:top w:type="dxa" w:w="60"/>
+              <w:left w:type="dxa" w:w="100"/>
+              <w:bottom w:type="dxa" w:w="60"/>
+              <w:right w:type="dxa" w:w="100"/>
+            </w:tcMar>
+          </w:tcPr>
+          <w:p>
+            <w:r>
+              <w:rPr>
+                <w:rFonts w:ascii="Calibri" w:cs="Calibri" w:eastAsia="Calibri" w:hAnsi="Calibri"/>
+                <w:b w:val="false"/>
+                <w:bCs w:val="false"/>
+                <w:color w:val="000000"/>
+                <w:sz w:val="18"/>
+                <w:szCs w:val="18"/>
+              </w:rPr>
+              <w:t xml:space="preserve">no public data found</w:t>
+            </w:r>
+          </w:p>
+        </w:tc>
+        <w:tc>
+          <w:tcPr>
+            <w:tcW w:type="dxa" w:w="900"/>
+            <w:tcBorders>
+              <w:top w:val="single" w:color="BFBFBF" w:sz="4"/>
+              <w:left w:val="single" w:color="BFBFBF" w:sz="4"/>
+              <w:bottom w:val="single" w:color="BFBFBF" w:sz="4"/>
+              <w:right w:val="single" w:color="BFBFBF" w:sz="4"/>
+            </w:tcBorders>
+            <w:tcMar>
+              <w:top w:type="dxa" w:w="60"/>
+              <w:left w:type="dxa" w:w="100"/>
+              <w:bottom w:type="dxa" w:w="60"/>
+              <w:right w:type="dxa" w:w="100"/>
+            </w:tcMar>
+          </w:tcPr>
+          <w:p>
+            <w:r>
+              <w:rPr>
+                <w:rFonts w:ascii="Calibri" w:cs="Calibri" w:eastAsia="Calibri" w:hAnsi="Calibri"/>
+                <w:b w:val="false"/>
+                <w:bCs w:val="false"/>
+                <w:color w:val="000000"/>
+                <w:sz w:val="18"/>
+                <w:szCs w:val="18"/>
+              </w:rPr>
+              <w:t xml:space="preserve"/>
+            </w:r>
+          </w:p>
+        </w:tc>
+        <w:tc>
+          <w:tcPr>
+            <w:tcW w:type="dxa" w:w="1926"/>
+            <w:tcBorders>
+              <w:top w:val="single" w:color="BFBFBF" w:sz="4"/>
+              <w:left w:val="single" w:color="BFBFBF" w:sz="4"/>
+              <w:bottom w:val="single" w:color="BFBFBF" w:sz="4"/>
+              <w:right w:val="single" w:color="BFBFBF" w:sz="4"/>
+            </w:tcBorders>
+            <w:tcMar>
+              <w:top w:type="dxa" w:w="60"/>
+              <w:left w:type="dxa" w:w="100"/>
+              <w:bottom w:type="dxa" w:w="60"/>
+              <w:right w:type="dxa" w:w="100"/>
+            </w:tcMar>
+          </w:tcPr>
+          <w:p>
+            <w:r>
+              <w:rPr>
+                <w:rFonts w:ascii="Calibri" w:cs="Calibri" w:eastAsia="Calibri" w:hAnsi="Calibri"/>
+                <w:b w:val="false"/>
+                <w:bCs w:val="false"/>
+                <w:color w:val="000000"/>
+                <w:sz w:val="18"/>
+                <w:szCs w:val="18"/>
+              </w:rPr>
+              <w:t xml:space="preserve"/>
+            </w:r>
+          </w:p>
+        </w:tc>
+      </w:tr>
+    </w:tbl>
+    <w:p>
+      <w:pPr>
+        <w:spacing w:after="120"/>
+      </w:pPr>
+      <w:r>
+        <w:rPr>
+          <w:rFonts w:ascii="Calibri" w:cs="Calibri" w:eastAsia="Calibri" w:hAnsi="Calibri"/>
+          <w:sz w:val="21"/>
+          <w:szCs w:val="21"/>
+        </w:rPr>
+        <w:t xml:space="preserve"/>
+      </w:r>
+    </w:p>
+    <w:p>
+      <w:pPr>
+        <w:pStyle w:val="Heading2"/>
+        <w:spacing w:after="80" w:before="200"/>
+      </w:pPr>
+      <w:r>
+        <w:rPr>
+          <w:rFonts w:ascii="Calibri" w:cs="Calibri" w:eastAsia="Calibri" w:hAnsi="Calibri"/>
+          <w:b/>
+          <w:bCs/>
+          <w:color w:val="1F3864"/>
+          <w:sz w:val="23"/>
+          <w:szCs w:val="23"/>
+        </w:rPr>
+        <w:t xml:space="preserve">International benchmarks (context)</w:t>
+      </w:r>
+    </w:p>
+    <w:p>
+      <w:pPr>
+        <w:pStyle w:val="ListParagraph"/>
+        <w:numPr>
+          <w:ilvl w:val="0"/>
+          <w:numId w:val="2"/>
+        </w:numPr>
+        <w:spacing w:after="80"/>
+      </w:pPr>
+      <w:r>
+        <w:rPr>
+          <w:rFonts w:ascii="Calibri" w:cs="Calibri" w:eastAsia="Calibri" w:hAnsi="Calibri"/>
+          <w:sz w:val="21"/>
+          <w:szCs w:val="21"/>
+        </w:rPr>
+        <w:t xml:space="preserve">UK top-10 firms: chargeable hours of 1,433-1,521 for associates (NQ to 5 PQE), 1,375 for 9+ PQE and 1,125 for full equity partners; senior grades down 8-9% year on year. Top 51-100 firms: ~800-1,130 h.</w:t>
+      </w:r>
+      <w:r>
+        <w:rPr>
+          <w:rFonts w:ascii="Calibri" w:cs="Calibri" w:eastAsia="Calibri" w:hAnsi="Calibri"/>
+          <w:b/>
+          <w:bCs/>
+          <w:color w:val="595959"/>
+          <w:sz w:val="19"/>
+          <w:szCs w:val="19"/>
+        </w:rPr>
+        <w:t xml:space="preserve"> [FY2025]</w:t>
+      </w:r>
+      <w:r>
+        <w:rPr>
+          <w:rFonts w:ascii="Calibri" w:cs="Calibri" w:eastAsia="Calibri" w:hAnsi="Calibri"/>
+          <w:i/>
+          <w:iCs/>
+          <w:color w:val="595959"/>
+          <w:sz w:val="18"/>
+          <w:szCs w:val="18"/>
+        </w:rPr>
+        <w:t xml:space="preserve"> Source: </w:t>
+      </w:r>
+      <w:r>
+        <w:rPr>
+          <w:rFonts w:ascii="Calibri" w:cs="Calibri" w:eastAsia="Calibri" w:hAnsi="Calibri"/>
+          <w:i/>
+          <w:iCs/>
+          <w:color w:val="595959"/>
+          <w:sz w:val="18"/>
+          <w:szCs w:val="18"/>
+        </w:rPr>
+        <w:t xml:space="preserve">PwC UK Law Firms' Survey, Oct 2025</w:t>
+      </w:r>
+    </w:p>
+    <w:p>
+      <w:pPr>
+        <w:pStyle w:val="ListParagraph"/>
+        <w:numPr>
+          <w:ilvl w:val="0"/>
+          <w:numId w:val="2"/>
+        </w:numPr>
+        <w:spacing w:after="80"/>
+      </w:pPr>
+      <w:r>
+        <w:rPr>
+          <w:rFonts w:ascii="Calibri" w:cs="Calibri" w:eastAsia="Calibri" w:hAnsi="Calibri"/>
+          <w:sz w:val="21"/>
+          <w:szCs w:val="21"/>
+        </w:rPr>
+        <w:t xml:space="preserve">UK: 36% of top-100 firms write off 15%+ of fee income; lock-up 135-145 days; firms expect AI to cut chargeable time by ~16%.</w:t>
+      </w:r>
+      <w:r>
+        <w:rPr>
+          <w:rFonts w:ascii="Calibri" w:cs="Calibri" w:eastAsia="Calibri" w:hAnsi="Calibri"/>
+          <w:b/>
+          <w:bCs/>
+          <w:color w:val="595959"/>
+          <w:sz w:val="19"/>
+          <w:szCs w:val="19"/>
+        </w:rPr>
+        <w:t xml:space="preserve"> [FY2025]</w:t>
+      </w:r>
+      <w:r>
+        <w:rPr>
+          <w:rFonts w:ascii="Calibri" w:cs="Calibri" w:eastAsia="Calibri" w:hAnsi="Calibri"/>
+          <w:i/>
+          <w:iCs/>
+          <w:color w:val="595959"/>
+          <w:sz w:val="18"/>
+          <w:szCs w:val="18"/>
+        </w:rPr>
+        <w:t xml:space="preserve"> Source: </w:t>
+      </w:r>
+      <w:r>
+        <w:rPr>
+          <w:rFonts w:ascii="Calibri" w:cs="Calibri" w:eastAsia="Calibri" w:hAnsi="Calibri"/>
+          <w:i/>
+          <w:iCs/>
+          <w:color w:val="595959"/>
+          <w:sz w:val="18"/>
+          <w:szCs w:val="18"/>
+        </w:rPr>
+        <w:t xml:space="preserve">PwC UK Law Firms' Survey</w:t>
+      </w:r>
+    </w:p>
+    <w:p>
+      <w:pPr>
+        <w:pStyle w:val="ListParagraph"/>
+        <w:numPr>
+          <w:ilvl w:val="0"/>
+          <w:numId w:val="2"/>
+        </w:numPr>
+        <w:spacing w:after="80"/>
+      </w:pPr>
+      <w:r>
+        <w:rPr>
+          <w:rFonts w:ascii="Calibri" w:cs="Calibri" w:eastAsia="Calibri" w:hAnsi="Calibri"/>
+          <w:sz w:val="21"/>
+          <w:szCs w:val="21"/>
+        </w:rPr>
+        <w:t xml:space="preserve">US: collected realisation ~90% of worked rates (associates 85.6%); hours per lawyer flat (~1,589); growth driven by rates (+7.1% worked rates, Q4 2025).</w:t>
+      </w:r>
+      <w:r>
+        <w:rPr>
+          <w:rFonts w:ascii="Calibri" w:cs="Calibri" w:eastAsia="Calibri" w:hAnsi="Calibri"/>
+          <w:b/>
+          <w:bCs/>
+          <w:color w:val="595959"/>
+          <w:sz w:val="19"/>
+          <w:szCs w:val="19"/>
+        </w:rPr>
+        <w:t xml:space="preserve"> [2025]</w:t>
+      </w:r>
+      <w:r>
+        <w:rPr>
+          <w:rFonts w:ascii="Calibri" w:cs="Calibri" w:eastAsia="Calibri" w:hAnsi="Calibri"/>
+          <w:i/>
+          <w:iCs/>
+          <w:color w:val="595959"/>
+          <w:sz w:val="18"/>
+          <w:szCs w:val="18"/>
+        </w:rPr>
+        <w:t xml:space="preserve"> Source: </w:t>
+      </w:r>
+      <w:r>
+        <w:rPr>
+          <w:rFonts w:ascii="Calibri" w:cs="Calibri" w:eastAsia="Calibri" w:hAnsi="Calibri"/>
+          <w:i/>
+          <w:iCs/>
+          <w:color w:val="595959"/>
+          <w:sz w:val="18"/>
+          <w:szCs w:val="18"/>
+        </w:rPr>
+        <w:t xml:space="preserve">Thomson Reuters; Wells Fargo LSG</w:t>
+      </w:r>
+    </w:p>
+    <w:p>
+      <w:pPr>
+        <w:spacing w:after="120"/>
+      </w:pPr>
+      <w:r>
+        <w:rPr>
+          <w:rFonts w:ascii="Calibri" w:cs="Calibri" w:eastAsia="Calibri" w:hAnsi="Calibri"/>
+          <w:b/>
+          <w:bCs/>
+          <w:sz w:val="21"/>
+          <w:szCs w:val="21"/>
+        </w:rPr>
+        <w:t xml:space="preserve">Implications: </w:t>
+      </w:r>
+      <w:r>
+        <w:rPr>
+          <w:rFonts w:ascii="Calibri" w:cs="Calibri" w:eastAsia="Calibri" w:hAnsi="Calibri"/>
+          <w:sz w:val="21"/>
+          <w:szCs w:val="21"/>
+        </w:rPr>
+        <w:t xml:space="preserve">model ~1,200-1,300 billable hours as the Nordic norm and a further ~10-15% realisation haircut; utilisation is unlikely to be the main margin lever (AI and hour scrutiny cap it), so rates, leverage and alternative pricing matter more. Recorded hours understate actual effort (Norway, Denmark surveys).</w:t>
       </w:r>
     </w:p>
     <w:p>
@@ -4719,7 +6199,7 @@
         </w:rPr>
         <w:t xml:space="preserve"> Source: </w:t>
       </w:r>
-      <w:hyperlink w:history="1" r:id="rIdb_qlsc9eztxzidto7veoy">
+      <w:hyperlink w:history="1" r:id="rIdnnux_xzpjey79f_l7_1rs">
         <w:r>
           <w:rPr>
             <w:rStyle w:val="Hyperlink"/>
@@ -4772,7 +6252,7 @@
         </w:rPr>
         <w:t xml:space="preserve"> Source: </w:t>
       </w:r>
-      <w:hyperlink w:history="1" r:id="rIdm09qjqi3amj_tm8l4hsac">
+      <w:hyperlink w:history="1" r:id="rId-okpzou_dohiho53-hiaz">
         <w:r>
           <w:rPr>
             <w:rStyle w:val="Hyperlink"/>
@@ -4825,7 +6305,7 @@
         </w:rPr>
         <w:t xml:space="preserve"> Source: </w:t>
       </w:r>
-      <w:hyperlink w:history="1" r:id="rIdn8wtf7m_1hno_fa9ayulh">
+      <w:hyperlink w:history="1" r:id="rId7rvnx_qb2hszixc7r6xbm">
         <w:r>
           <w:rPr>
             <w:rStyle w:val="Hyperlink"/>
@@ -4878,7 +6358,7 @@
         </w:rPr>
         <w:t xml:space="preserve"> Source: </w:t>
       </w:r>
-      <w:hyperlink w:history="1" r:id="rIdeg-eawuv-plyfsadcqolo">
+      <w:hyperlink w:history="1" r:id="rIdruawlw23qobmrlomhanna">
         <w:r>
           <w:rPr>
             <w:rStyle w:val="Hyperlink"/>
@@ -4931,7 +6411,7 @@
         </w:rPr>
         <w:t xml:space="preserve"> Source: </w:t>
       </w:r>
-      <w:hyperlink w:history="1" r:id="rId7csqxizlxnlv2u2qfnmsb">
+      <w:hyperlink w:history="1" r:id="rIds080pnrkbscusixusga7o">
         <w:r>
           <w:rPr>
             <w:rStyle w:val="Hyperlink"/>

</xml_diff>

<commit_message>
Remove legal-aid and public-sector references; focus on business-law firms only
Co-Authored-By: Claude Opus 5.5 <noreply@anthropic.com>
Claude-Session: https://claude.ai/code/session_01Tu61bPEQej1E6sErbEFanY
</commit_message>
<xml_diff>
--- a/research/swedish_legal_charging_rates.docx
+++ b/research/swedish_legal_charging_rates.docx
@@ -90,7 +90,7 @@
         </w:rPr>
         <w:t xml:space="preserve"> Source: </w:t>
       </w:r>
-      <w:hyperlink w:history="1" r:id="rIdflrdjrlpceo38zdmg8yys">
+      <w:hyperlink w:history="1" r:id="rIdc-74keqdyjw002jpyddwh">
         <w:r>
           <w:rPr>
             <w:rStyle w:val="Hyperlink"/>
@@ -194,7 +194,7 @@
         </w:rPr>
         <w:t xml:space="preserve"> Source: </w:t>
       </w:r>
-      <w:hyperlink w:history="1" r:id="rId6x9emddqv9aecd8eq2ech">
+      <w:hyperlink w:history="1" r:id="rIdid-fdsyvb7qt4ocgbxc4q">
         <w:r>
           <w:rPr>
             <w:rStyle w:val="Hyperlink"/>
@@ -247,7 +247,7 @@
         </w:rPr>
         <w:t xml:space="preserve"> Source: </w:t>
       </w:r>
-      <w:hyperlink w:history="1" r:id="rIdqu8avolvwy5rt4waqzyfr">
+      <w:hyperlink w:history="1" r:id="rIdpr7ctmaahgd8koygawwc2">
         <w:r>
           <w:rPr>
             <w:rStyle w:val="Hyperlink"/>
@@ -1595,7 +1595,7 @@
         </w:rPr>
         <w:t xml:space="preserve"> Source: </w:t>
       </w:r>
-      <w:hyperlink w:history="1" r:id="rIdsvo3l0ih7u1b8h0egvyqn">
+      <w:hyperlink w:history="1" r:id="rIdrq642ko2g4d2bk-x-kk_e">
         <w:r>
           <w:rPr>
             <w:rStyle w:val="Hyperlink"/>
@@ -1648,7 +1648,7 @@
         </w:rPr>
         <w:t xml:space="preserve"> Source: </w:t>
       </w:r>
-      <w:hyperlink w:history="1" r:id="rIdmua1zn7kccgpfxueppneb">
+      <w:hyperlink w:history="1" r:id="rIddlvfy0qi0oqn5cjmtruhb">
         <w:r>
           <w:rPr>
             <w:rStyle w:val="Hyperlink"/>
@@ -1701,7 +1701,7 @@
         </w:rPr>
         <w:t xml:space="preserve"> Source: </w:t>
       </w:r>
-      <w:hyperlink w:history="1" r:id="rIdo0fhvecsdwfobxypbpezf">
+      <w:hyperlink w:history="1" r:id="rIdgcr_oxnu0gawjer6e1c9v">
         <w:r>
           <w:rPr>
             <w:rStyle w:val="Hyperlink"/>
@@ -1754,7 +1754,7 @@
         </w:rPr>
         <w:t xml:space="preserve"> Source: </w:t>
       </w:r>
-      <w:hyperlink w:history="1" r:id="rIdc6svbr5qexkvjzhyooug-">
+      <w:hyperlink w:history="1" r:id="rIdlzmywf5gbuk8bia7xtbln">
         <w:r>
           <w:rPr>
             <w:rStyle w:val="Hyperlink"/>
@@ -1837,7 +1837,7 @@
         </w:rPr>
         <w:t xml:space="preserve"> Source: </w:t>
       </w:r>
-      <w:hyperlink w:history="1" r:id="rIdzgwees3ivjuseutbdxgcj">
+      <w:hyperlink w:history="1" r:id="rIdai1loxy9rs4akcr2pdpr1">
         <w:r>
           <w:rPr>
             <w:rStyle w:val="Hyperlink"/>
@@ -1890,7 +1890,7 @@
         </w:rPr>
         <w:t xml:space="preserve"> Source: </w:t>
       </w:r>
-      <w:hyperlink w:history="1" r:id="rIdreqtrin9dlj9bxyo58pob">
+      <w:hyperlink w:history="1" r:id="rIdi736zqvja1ino6oqdeo3n">
         <w:r>
           <w:rPr>
             <w:rStyle w:val="Hyperlink"/>
@@ -1943,7 +1943,7 @@
         </w:rPr>
         <w:t xml:space="preserve"> Source: </w:t>
       </w:r>
-      <w:hyperlink w:history="1" r:id="rIdevxmul5stujx_wiqpaihv">
+      <w:hyperlink w:history="1" r:id="rIdbhdzuvejdxxmz052b2hef">
         <w:r>
           <w:rPr>
             <w:rStyle w:val="Hyperlink"/>
@@ -1996,7 +1996,7 @@
         </w:rPr>
         <w:t xml:space="preserve"> Source: </w:t>
       </w:r>
-      <w:hyperlink w:history="1" r:id="rIdcsz3_bfu_88iz87m0nag-">
+      <w:hyperlink w:history="1" r:id="rIdaawisbsk-wg8jepq7n8mi">
         <w:r>
           <w:rPr>
             <w:rStyle w:val="Hyperlink"/>
@@ -2049,7 +2049,7 @@
         </w:rPr>
         <w:t xml:space="preserve"> Source: </w:t>
       </w:r>
-      <w:hyperlink w:history="1" r:id="rIdtkcszpqohdpoqpf5enug_">
+      <w:hyperlink w:history="1" r:id="rIdyojkq7zaz-jbbvgu0wvyn">
         <w:r>
           <w:rPr>
             <w:rStyle w:val="Hyperlink"/>
@@ -2102,7 +2102,7 @@
         </w:rPr>
         <w:t xml:space="preserve"> Source: </w:t>
       </w:r>
-      <w:hyperlink w:history="1" r:id="rIdqc4wkxujub3scg_glglcg">
+      <w:hyperlink w:history="1" r:id="rId_oojlbrvhte8ydl3baoqy">
         <w:r>
           <w:rPr>
             <w:rStyle w:val="Hyperlink"/>
@@ -2195,7 +2195,7 @@
         </w:rPr>
         <w:t xml:space="preserve"> Source: </w:t>
       </w:r>
-      <w:hyperlink w:history="1" r:id="rId0rl4ky37ae3zgy_btqa1c">
+      <w:hyperlink w:history="1" r:id="rIdhrebrowqw8vwdhtdo9a1c">
         <w:r>
           <w:rPr>
             <w:rStyle w:val="Hyperlink"/>
@@ -2248,7 +2248,7 @@
         </w:rPr>
         <w:t xml:space="preserve"> Source: </w:t>
       </w:r>
-      <w:hyperlink w:history="1" r:id="rIdmfe00gbbunrq5leuuxier">
+      <w:hyperlink w:history="1" r:id="rIdgg6plr2tnd5yxtlqunocw">
         <w:r>
           <w:rPr>
             <w:rStyle w:val="Hyperlink"/>
@@ -2331,7 +2331,7 @@
         </w:rPr>
         <w:t xml:space="preserve"> Source: </w:t>
       </w:r>
-      <w:hyperlink w:history="1" r:id="rIdstrbimnkigetw6cxhtwvt">
+      <w:hyperlink w:history="1" r:id="rIdicwblhao2pzdf1uocbp6i">
         <w:r>
           <w:rPr>
             <w:rStyle w:val="Hyperlink"/>
@@ -2435,7 +2435,7 @@
         </w:rPr>
         <w:t xml:space="preserve"> Source: </w:t>
       </w:r>
-      <w:hyperlink w:history="1" r:id="rIdeendcdz7dpbhml03umipd">
+      <w:hyperlink w:history="1" r:id="rIdzjiiqxnmii9pdxztgcekz">
         <w:r>
           <w:rPr>
             <w:rStyle w:val="Hyperlink"/>
@@ -2488,7 +2488,7 @@
         </w:rPr>
         <w:t xml:space="preserve"> Source: </w:t>
       </w:r>
-      <w:hyperlink w:history="1" r:id="rIdm3oddnivnmqigwxqfbelw">
+      <w:hyperlink w:history="1" r:id="rIdlou64ribiio12snpnvwlk">
         <w:r>
           <w:rPr>
             <w:rStyle w:val="Hyperlink"/>
@@ -2541,7 +2541,7 @@
         </w:rPr>
         <w:t xml:space="preserve"> Source: </w:t>
       </w:r>
-      <w:hyperlink w:history="1" r:id="rId769jy2almazx23hkvykn5">
+      <w:hyperlink w:history="1" r:id="rId2htzv39-vdt-ewvf9mvvx">
         <w:r>
           <w:rPr>
             <w:rStyle w:val="Hyperlink"/>
@@ -2594,7 +2594,7 @@
         </w:rPr>
         <w:t xml:space="preserve"> Source: </w:t>
       </w:r>
-      <w:hyperlink w:history="1" r:id="rIdjvwx7phsatdfkusikslgy">
+      <w:hyperlink w:history="1" r:id="rIdqqqp1phuq9nyp-wzz-cem">
         <w:r>
           <w:rPr>
             <w:rStyle w:val="Hyperlink"/>
@@ -2664,7 +2664,7 @@
         </w:rPr>
         <w:t xml:space="preserve"> Source: </w:t>
       </w:r>
-      <w:hyperlink w:history="1" r:id="rIdhkuczrn3k4_vqfda070ca">
+      <w:hyperlink w:history="1" r:id="rIdckzl0scjyk4cj1c8y6max">
         <w:r>
           <w:rPr>
             <w:rStyle w:val="Hyperlink"/>
@@ -2853,7 +2853,7 @@
         </w:rPr>
         <w:t xml:space="preserve"> Source: </w:t>
       </w:r>
-      <w:hyperlink w:history="1" r:id="rId2ejrq1jo4mlwxhdmzdq-m">
+      <w:hyperlink w:history="1" r:id="rIds4csydqmcmjp9_idizg2u">
         <w:r>
           <w:rPr>
             <w:rStyle w:val="Hyperlink"/>
@@ -2906,7 +2906,7 @@
         </w:rPr>
         <w:t xml:space="preserve"> Source: </w:t>
       </w:r>
-      <w:hyperlink w:history="1" r:id="rIdu-c8ybrbig1xdrtbc75ww">
+      <w:hyperlink w:history="1" r:id="rIdcebsmnolix-qghlxtnahk">
         <w:r>
           <w:rPr>
             <w:rStyle w:val="Hyperlink"/>
@@ -2959,7 +2959,7 @@
         </w:rPr>
         <w:t xml:space="preserve"> Source: </w:t>
       </w:r>
-      <w:hyperlink w:history="1" r:id="rId5xg8eae71gje5_pjmt2hf">
+      <w:hyperlink w:history="1" r:id="rIdagcm6tzdyx6n35hvuxftb">
         <w:r>
           <w:rPr>
             <w:rStyle w:val="Hyperlink"/>
@@ -3012,7 +3012,7 @@
         </w:rPr>
         <w:t xml:space="preserve"> Source: </w:t>
       </w:r>
-      <w:hyperlink w:history="1" r:id="rIdgjov_f-ik4hn66jg7ie4m">
+      <w:hyperlink w:history="1" r:id="rIdfb5eis-w0d8lzqxah4gdf">
         <w:r>
           <w:rPr>
             <w:rStyle w:val="Hyperlink"/>
@@ -3065,7 +3065,7 @@
         </w:rPr>
         <w:t xml:space="preserve"> Source: </w:t>
       </w:r>
-      <w:hyperlink w:history="1" r:id="rIdesqspbut9lymyq39fs8fr">
+      <w:hyperlink w:history="1" r:id="rId_qs7erwtimoibqui7nqbg">
         <w:r>
           <w:rPr>
             <w:rStyle w:val="Hyperlink"/>
@@ -3118,7 +3118,7 @@
         </w:rPr>
         <w:t xml:space="preserve"> Source: </w:t>
       </w:r>
-      <w:hyperlink w:history="1" r:id="rIdjfytdjplubmrwrrvejwas">
+      <w:hyperlink w:history="1" r:id="rIduudzaynk3cekqv2uldyhv">
         <w:r>
           <w:rPr>
             <w:rStyle w:val="Hyperlink"/>
@@ -3188,7 +3188,7 @@
         </w:rPr>
         <w:t xml:space="preserve"> Source: </w:t>
       </w:r>
-      <w:hyperlink w:history="1" r:id="rIdkex9i-ooisk7izn97ds_v">
+      <w:hyperlink w:history="1" r:id="rIdynf0eyqusqdkhu2_ezpcy">
         <w:r>
           <w:rPr>
             <w:rStyle w:val="Hyperlink"/>
@@ -3241,7 +3241,7 @@
         </w:rPr>
         <w:t xml:space="preserve"> Source: </w:t>
       </w:r>
-      <w:hyperlink w:history="1" r:id="rIdxlflw5a7tmpweqn0dexnt">
+      <w:hyperlink w:history="1" r:id="rId4r193uvtz3oswcsgkyso1">
         <w:r>
           <w:rPr>
             <w:rStyle w:val="Hyperlink"/>
@@ -3294,7 +3294,7 @@
         </w:rPr>
         <w:t xml:space="preserve"> Source: </w:t>
       </w:r>
-      <w:hyperlink w:history="1" r:id="rIdghonf5yk2k4f3_kqu0vwa">
+      <w:hyperlink w:history="1" r:id="rIdu__4egedsglfa-x-qdkez">
         <w:r>
           <w:rPr>
             <w:rStyle w:val="Hyperlink"/>
@@ -3347,7 +3347,7 @@
         </w:rPr>
         <w:t xml:space="preserve"> Source: </w:t>
       </w:r>
-      <w:hyperlink w:history="1" r:id="rIdq3bwiipk0mmttjy0hat0c">
+      <w:hyperlink w:history="1" r:id="rIddfdilceeo8j97ux627ziy">
         <w:r>
           <w:rPr>
             <w:rStyle w:val="Hyperlink"/>
@@ -3440,7 +3440,7 @@
         </w:rPr>
         <w:t xml:space="preserve"> Source: </w:t>
       </w:r>
-      <w:hyperlink w:history="1" r:id="rIds2x-ijmyk9ms1ohu8qst_">
+      <w:hyperlink w:history="1" r:id="rIdiezmov4umu7_wcowo9yjz">
         <w:r>
           <w:rPr>
             <w:rStyle w:val="Hyperlink"/>
@@ -3532,7 +3532,7 @@
           <w:sz w:val="21"/>
           <w:szCs w:val="21"/>
         </w:rPr>
-        <w:t xml:space="preserve">Few Nordic firms publish utilisation; the evidence is mainly industry-level. Three independent Nordic bases point to ~1,200-1,300 billable hours (70-75% of a ~1,650-1,700 hour year), while large business-law firms target more for associates.</w:t>
+        <w:t xml:space="preserve">Few Nordic business-law firms publish utilisation; the evidence is mainly industry-level. Swedish and Norwegian law-firm surveys point to ~70-72% of working time billed (~1,200-1,300 billable hours), while large business-law firms target ~1,400-1,600 hours for associates.</w:t>
       </w:r>
     </w:p>
     <w:tbl>
@@ -6199,7 +6199,7 @@
         </w:rPr>
         <w:t xml:space="preserve"> Source: </w:t>
       </w:r>
-      <w:hyperlink w:history="1" r:id="rIdnnux_xzpjey79f_l7_1rs">
+      <w:hyperlink w:history="1" r:id="rIdjuzyd4cspnfd6iuiyya6m">
         <w:r>
           <w:rPr>
             <w:rStyle w:val="Hyperlink"/>
@@ -6252,7 +6252,7 @@
         </w:rPr>
         <w:t xml:space="preserve"> Source: </w:t>
       </w:r>
-      <w:hyperlink w:history="1" r:id="rId-okpzou_dohiho53-hiaz">
+      <w:hyperlink w:history="1" r:id="rIdqpgkmzn9k08s_99dopscs">
         <w:r>
           <w:rPr>
             <w:rStyle w:val="Hyperlink"/>
@@ -6305,7 +6305,7 @@
         </w:rPr>
         <w:t xml:space="preserve"> Source: </w:t>
       </w:r>
-      <w:hyperlink w:history="1" r:id="rId7rvnx_qb2hszixc7r6xbm">
+      <w:hyperlink w:history="1" r:id="rIdt48jzyesasmo37g1sqhgv">
         <w:r>
           <w:rPr>
             <w:rStyle w:val="Hyperlink"/>
@@ -6358,7 +6358,7 @@
         </w:rPr>
         <w:t xml:space="preserve"> Source: </w:t>
       </w:r>
-      <w:hyperlink w:history="1" r:id="rIdruawlw23qobmrlomhanna">
+      <w:hyperlink w:history="1" r:id="rIdrtvuotykdvblvyq_uwqw7">
         <w:r>
           <w:rPr>
             <w:rStyle w:val="Hyperlink"/>
@@ -6411,7 +6411,7 @@
         </w:rPr>
         <w:t xml:space="preserve"> Source: </w:t>
       </w:r>
-      <w:hyperlink w:history="1" r:id="rIds080pnrkbscusixusga7o">
+      <w:hyperlink w:history="1" r:id="rIdckvyym-6ox4lc66jnqfun">
         <w:r>
           <w:rPr>
             <w:rStyle w:val="Hyperlink"/>

</xml_diff>